<commit_message>
feat(video-film-editing): notes rewritten per officer 3.3a workflow; Rangka as outline; CA Soalan in official JPK format
26 Nota Pembelajaran restructured to the 3.3a Langkah 1-3 output (per Bab: Objektif Pembelajaran -> numbered sub-topics with tables -> Rumusan; TUJUAN paragraph; 3 questions; APA refs); 3.3b docx regenerated; 3.3a Rangka now the outline result (no prompt text); Buku Teks C01-C05 rebuilt (180 pp PDF with TOC); 14 Core Abilities Soalan Penilaian rebuilt on the official JPK docx template with the real JPK logo (docx+pdf); generator scripts collected in output/_tools; official JPK logo extracted to output/_assets.

Co-Authored-By: Claude Opus 5 <noreply@anthropic.com>
</commit_message>
<xml_diff>
--- a/video-film-editing/output/04 3.3a Rangka Nota Pembelajaran/3.3a-01 Rangka Nota Pembelajaran C01 VISUAL EDITING PROJECT ANALYSIS (IT-072).docx
+++ b/video-film-editing/output/04 3.3a Rangka Nota Pembelajaran/3.3a-01 Rangka Nota Pembelajaran C01 VISUAL EDITING PROJECT ANALYSIS (IT-072).docx
@@ -22,7 +22,7 @@
           <w:szCs w:val="24"/>
           <w:lang w:val="pt-BR"/>
         </w:rPr>
-        <w:t>3.3a Rangka Nota Pembelajaran — IT-072-3:2012-C01 Visual Editing Project Analysis</w:t>
+        <w:t>RANGKA NOTA PEMBELAJARAN — IT-072-3:2012-C01 Visual Editing Project Analysis</w:t>
       </w:r>
     </w:p>
     <w:tbl>
@@ -175,49 +175,963 @@
     </w:tbl>
     <w:p/>
     <w:p>
-      <w:pPr>
-        <w:pStyle w:val="Heading2"/>
-      </w:pPr>
       <w:r>
-        <w:t>WA1 — Analyse visual editing project script (IT-072-3:2012-C01-W01)</w:t>
+        <w:rPr>
+          <w:b/>
+          <w:sz w:val="24"/>
+        </w:rPr>
+        <w:t>Aktiviti Kerja 1: Analyse visual editing project script  (IT-072-3:2012-C01-W01)</w:t>
       </w:r>
     </w:p>
+    <w:p>
+      <w:r>
+        <w:t>Rangka topik (Bab dan sub-topik):</w:t>
+      </w:r>
+    </w:p>
+    <w:tbl>
+      <w:tblPr>
+        <w:tblW w:type="auto" w:w="0"/>
+        <w:tblLook w:firstColumn="1" w:firstRow="1" w:lastColumn="0" w:lastRow="0" w:noHBand="0" w:noVBand="1" w:val="04A0"/>
+      </w:tblPr>
+      <w:tblGrid>
+        <w:gridCol w:w="4513"/>
+        <w:gridCol w:w="4513"/>
+      </w:tblGrid>
+      <w:tr>
+        <w:tc>
+          <w:tcPr>
+            <w:tcW w:type="dxa" w:w="4513"/>
+          </w:tcPr>
+          <w:p>
+            <w:r>
+              <w:rPr>
+                <w:b/>
+              </w:rPr>
+              <w:t>Bab</w:t>
+            </w:r>
+          </w:p>
+        </w:tc>
+        <w:tc>
+          <w:tcPr>
+            <w:tcW w:type="dxa" w:w="4513"/>
+          </w:tcPr>
+          <w:p>
+            <w:r>
+              <w:rPr>
+                <w:b/>
+              </w:rPr>
+              <w:t>Sub-topik</w:t>
+            </w:r>
+          </w:p>
+        </w:tc>
+      </w:tr>
+      <w:tr>
+        <w:tc>
+          <w:tcPr>
+            <w:tcW w:type="dxa" w:w="4513"/>
+          </w:tcPr>
+          <w:p>
+            <w:r>
+              <w:t>Bab 1: Types of Script</w:t>
+            </w:r>
+          </w:p>
+        </w:tc>
+        <w:tc>
+          <w:tcPr>
+            <w:tcW w:type="dxa" w:w="4513"/>
+          </w:tcPr>
+          <w:p>
+            <w:r>
+              <w:t>1. Definisi dan Kepentingan Skrip</w:t>
+              <w:br/>
+              <w:t>2. Jenis-jenis Skrip dalam Industri</w:t>
+              <w:br/>
+              <w:t>3. Contoh Amalan Studio</w:t>
+            </w:r>
+          </w:p>
+        </w:tc>
+      </w:tr>
+      <w:tr>
+        <w:tc>
+          <w:tcPr>
+            <w:tcW w:type="dxa" w:w="4513"/>
+          </w:tcPr>
+          <w:p>
+            <w:r>
+              <w:t>Bab 2: Project Concept — Storyline, Message, Theme, Genre</w:t>
+            </w:r>
+          </w:p>
+        </w:tc>
+        <w:tc>
+          <w:tcPr>
+            <w:tcW w:type="dxa" w:w="4513"/>
+          </w:tcPr>
+          <w:p>
+            <w:r>
+              <w:t>1. Storyline dan Message</w:t>
+              <w:br/>
+              <w:t>2. Theme dan Genre</w:t>
+              <w:br/>
+              <w:t>3. Contoh Amalan Industri</w:t>
+            </w:r>
+          </w:p>
+        </w:tc>
+      </w:tr>
+      <w:tr>
+        <w:tc>
+          <w:tcPr>
+            <w:tcW w:type="dxa" w:w="4513"/>
+          </w:tcPr>
+          <w:p>
+            <w:r>
+              <w:t>Bab 3: Type of Audio — Dialogue, Voice Over, Music, Ambience</w:t>
+            </w:r>
+          </w:p>
+        </w:tc>
+        <w:tc>
+          <w:tcPr>
+            <w:tcW w:type="dxa" w:w="4513"/>
+          </w:tcPr>
+          <w:p>
+            <w:r>
+              <w:t>1. Klasifikasi Jenis Audio</w:t>
+              <w:br/>
+              <w:t>2. Kaitan dengan Perancangan Projek</w:t>
+            </w:r>
+          </w:p>
+        </w:tc>
+      </w:tr>
+      <w:tr>
+        <w:tc>
+          <w:tcPr>
+            <w:tcW w:type="dxa" w:w="4513"/>
+          </w:tcPr>
+          <w:p>
+            <w:r>
+              <w:t>Bab 4: Type of Language Version — Single, Bi-language, Multi Language</w:t>
+            </w:r>
+          </w:p>
+        </w:tc>
+        <w:tc>
+          <w:tcPr>
+            <w:tcW w:type="dxa" w:w="4513"/>
+          </w:tcPr>
+          <w:p>
+            <w:r>
+              <w:t>1. Jenis-jenis Versi Bahasa</w:t>
+              <w:br/>
+              <w:t>2. Implikasi terhadap Struktur Timeline</w:t>
+            </w:r>
+          </w:p>
+        </w:tc>
+      </w:tr>
+      <w:tr>
+        <w:tc>
+          <w:tcPr>
+            <w:tcW w:type="dxa" w:w="4513"/>
+          </w:tcPr>
+          <w:p>
+            <w:r>
+              <w:t>Bab 5: Project Media Output — Web, Tape, Film, Hardisk, DVD/Blu-ray, 3D Stereoscopic</w:t>
+            </w:r>
+          </w:p>
+        </w:tc>
+        <w:tc>
+          <w:tcPr>
+            <w:tcW w:type="dxa" w:w="4513"/>
+          </w:tcPr>
+          <w:p>
+            <w:r>
+              <w:t>1. Jenis-jenis Output Media</w:t>
+              <w:br/>
+              <w:t>2. Kaitan dengan Sequence Settings</w:t>
+            </w:r>
+          </w:p>
+        </w:tc>
+      </w:tr>
+      <w:tr>
+        <w:tc>
+          <w:tcPr>
+            <w:tcW w:type="dxa" w:w="4513"/>
+          </w:tcPr>
+          <w:p>
+            <w:r>
+              <w:t>Bab 6: Project Duration — Script Requirement, Man Hour Requirement, Machine Availability</w:t>
+            </w:r>
+          </w:p>
+        </w:tc>
+        <w:tc>
+          <w:tcPr>
+            <w:tcW w:type="dxa" w:w="4513"/>
+          </w:tcPr>
+          <w:p>
+            <w:r>
+              <w:t>1. Script Requirement</w:t>
+              <w:br/>
+              <w:t>2. Man Hour Requirement</w:t>
+              <w:br/>
+              <w:t>3. Machine Availability</w:t>
+            </w:r>
+          </w:p>
+        </w:tc>
+      </w:tr>
+      <w:tr>
+        <w:tc>
+          <w:tcPr>
+            <w:tcW w:type="dxa" w:w="4513"/>
+          </w:tcPr>
+          <w:p>
+            <w:r>
+              <w:t>Bab 7: Editing Technique in Theory</w:t>
+            </w:r>
+          </w:p>
+        </w:tc>
+        <w:tc>
+          <w:tcPr>
+            <w:tcW w:type="dxa" w:w="4513"/>
+          </w:tcPr>
+          <w:p>
+            <w:r>
+              <w:t>1. Senarai Teknik Editing</w:t>
+              <w:br/>
+              <w:t>2. Kegunaan pada Peringkat Analisis</w:t>
+            </w:r>
+          </w:p>
+        </w:tc>
+      </w:tr>
+    </w:tbl>
     <w:p/>
     <w:p>
-      <w:pPr>
-        <w:pStyle w:val="Heading2"/>
-      </w:pPr>
       <w:r>
-        <w:t>WA2 — Analyse visual editing project concept (IT-072-3:2012-C01-W02)</w:t>
+        <w:rPr>
+          <w:b/>
+          <w:sz w:val="24"/>
+        </w:rPr>
+        <w:t>Aktiviti Kerja 2: Analyse visual editing project concept  (IT-072-3:2012-C01-W02)</w:t>
       </w:r>
     </w:p>
+    <w:p>
+      <w:r>
+        <w:t>Rangka topik (Bab dan sub-topik):</w:t>
+      </w:r>
+    </w:p>
+    <w:tbl>
+      <w:tblPr>
+        <w:tblW w:type="auto" w:w="0"/>
+        <w:tblLook w:firstColumn="1" w:firstRow="1" w:lastColumn="0" w:lastRow="0" w:noHBand="0" w:noVBand="1" w:val="04A0"/>
+      </w:tblPr>
+      <w:tblGrid>
+        <w:gridCol w:w="4513"/>
+        <w:gridCol w:w="4513"/>
+      </w:tblGrid>
+      <w:tr>
+        <w:tc>
+          <w:tcPr>
+            <w:tcW w:type="dxa" w:w="4513"/>
+          </w:tcPr>
+          <w:p>
+            <w:r>
+              <w:rPr>
+                <w:b/>
+              </w:rPr>
+              <w:t>Bab</w:t>
+            </w:r>
+          </w:p>
+        </w:tc>
+        <w:tc>
+          <w:tcPr>
+            <w:tcW w:type="dxa" w:w="4513"/>
+          </w:tcPr>
+          <w:p>
+            <w:r>
+              <w:rPr>
+                <w:b/>
+              </w:rPr>
+              <w:t>Sub-topik</w:t>
+            </w:r>
+          </w:p>
+        </w:tc>
+      </w:tr>
+      <w:tr>
+        <w:tc>
+          <w:tcPr>
+            <w:tcW w:type="dxa" w:w="4513"/>
+          </w:tcPr>
+          <w:p>
+            <w:r>
+              <w:t>Bab 1: Category of Genre</w:t>
+            </w:r>
+          </w:p>
+        </w:tc>
+        <w:tc>
+          <w:tcPr>
+            <w:tcW w:type="dxa" w:w="4513"/>
+          </w:tcPr>
+          <w:p>
+            <w:r>
+              <w:t>1. Senarai Kategori Genre</w:t>
+              <w:br/>
+              <w:t>2. Konvensyen Editing Mengikut Genre</w:t>
+            </w:r>
+          </w:p>
+        </w:tc>
+      </w:tr>
+      <w:tr>
+        <w:tc>
+          <w:tcPr>
+            <w:tcW w:type="dxa" w:w="4513"/>
+          </w:tcPr>
+          <w:p>
+            <w:r>
+              <w:t>Bab 2: Types of Genre</w:t>
+            </w:r>
+          </w:p>
+        </w:tc>
+        <w:tc>
+          <w:tcPr>
+            <w:tcW w:type="dxa" w:w="4513"/>
+          </w:tcPr>
+          <w:p>
+            <w:r>
+              <w:t>1. Pecahan Sub-genre (verbatim CoCU)</w:t>
+              <w:br/>
+              <w:t>2. Contoh Amalan</w:t>
+            </w:r>
+          </w:p>
+        </w:tc>
+      </w:tr>
+      <w:tr>
+        <w:tc>
+          <w:tcPr>
+            <w:tcW w:type="dxa" w:w="4513"/>
+          </w:tcPr>
+          <w:p>
+            <w:r>
+              <w:t>Bab 3: Category of Theme</w:t>
+            </w:r>
+          </w:p>
+        </w:tc>
+        <w:tc>
+          <w:tcPr>
+            <w:tcW w:type="dxa" w:w="4513"/>
+          </w:tcPr>
+          <w:p>
+            <w:r>
+              <w:t>1. Definisi Tema</w:t>
+              <w:br/>
+              <w:t>2. Tiga Kategori Tema (verbatim CoCU)</w:t>
+              <w:br/>
+              <w:t>3. Kesan terhadap Penyuntingan</w:t>
+            </w:r>
+          </w:p>
+        </w:tc>
+      </w:tr>
+      <w:tr>
+        <w:tc>
+          <w:tcPr>
+            <w:tcW w:type="dxa" w:w="4513"/>
+          </w:tcPr>
+          <w:p>
+            <w:r>
+              <w:t>Bab 4: Visual Effect (VFX) Elements</w:t>
+            </w:r>
+          </w:p>
+        </w:tc>
+        <w:tc>
+          <w:tcPr>
+            <w:tcW w:type="dxa" w:w="4513"/>
+          </w:tcPr>
+          <w:p>
+            <w:r>
+              <w:t>1. Empat Elemen VFX (verbatim CoCU)</w:t>
+              <w:br/>
+              <w:t>2. Peranan Editor</w:t>
+            </w:r>
+          </w:p>
+        </w:tc>
+      </w:tr>
+      <w:tr>
+        <w:tc>
+          <w:tcPr>
+            <w:tcW w:type="dxa" w:w="4513"/>
+          </w:tcPr>
+          <w:p>
+            <w:r>
+              <w:t>Bab 5: Sound Effect</w:t>
+            </w:r>
+          </w:p>
+        </w:tc>
+        <w:tc>
+          <w:tcPr>
+            <w:tcW w:type="dxa" w:w="4513"/>
+          </w:tcPr>
+          <w:p>
+            <w:r>
+              <w:t>1. Kategori Sound Effect (verbatim CoCU)</w:t>
+              <w:br/>
+              <w:t>2. Kaitan dengan Perancangan Audio</w:t>
+            </w:r>
+          </w:p>
+        </w:tc>
+      </w:tr>
+      <w:tr>
+        <w:tc>
+          <w:tcPr>
+            <w:tcW w:type="dxa" w:w="4513"/>
+          </w:tcPr>
+          <w:p>
+            <w:r>
+              <w:t>Bab 6: Background Music</w:t>
+            </w:r>
+          </w:p>
+        </w:tc>
+        <w:tc>
+          <w:tcPr>
+            <w:tcW w:type="dxa" w:w="4513"/>
+          </w:tcPr>
+          <w:p>
+            <w:r>
+              <w:t>1. Enam Jenis Background Music (verbatim CoCU)</w:t>
+              <w:br/>
+              <w:t>2. Kesan terhadap Rentak Editing</w:t>
+            </w:r>
+          </w:p>
+        </w:tc>
+      </w:tr>
+      <w:tr>
+        <w:tc>
+          <w:tcPr>
+            <w:tcW w:type="dxa" w:w="4513"/>
+          </w:tcPr>
+          <w:p>
+            <w:r>
+              <w:t>Bab 7: Editing Technique (Konteks Kreatif)</w:t>
+            </w:r>
+          </w:p>
+        </w:tc>
+        <w:tc>
+          <w:tcPr>
+            <w:tcW w:type="dxa" w:w="4513"/>
+          </w:tcPr>
+          <w:p>
+            <w:r>
+              <w:t>1. Teknik Editing dalam Konteks Kreatif</w:t>
+              <w:br/>
+              <w:t>2. Penyelarasan dengan Elemen Kreatif Lain</w:t>
+            </w:r>
+          </w:p>
+        </w:tc>
+      </w:tr>
+    </w:tbl>
     <w:p/>
     <w:p>
-      <w:pPr>
-        <w:pStyle w:val="Heading2"/>
-      </w:pPr>
       <w:r>
-        <w:t>WA3 — Classify visual editing format and sources (IT-072-3:2012-C01-W03)</w:t>
+        <w:rPr>
+          <w:b/>
+          <w:sz w:val="24"/>
+        </w:rPr>
+        <w:t>Aktiviti Kerja 3: Classify visual editing format and source  (IT-072-3:2012-C01-W03)</w:t>
       </w:r>
     </w:p>
+    <w:p>
+      <w:r>
+        <w:t>Rangka topik (Bab dan sub-topik):</w:t>
+      </w:r>
+    </w:p>
+    <w:tbl>
+      <w:tblPr>
+        <w:tblW w:type="auto" w:w="0"/>
+        <w:tblLook w:firstColumn="1" w:firstRow="1" w:lastColumn="0" w:lastRow="0" w:noHBand="0" w:noVBand="1" w:val="04A0"/>
+      </w:tblPr>
+      <w:tblGrid>
+        <w:gridCol w:w="4513"/>
+        <w:gridCol w:w="4513"/>
+      </w:tblGrid>
+      <w:tr>
+        <w:tc>
+          <w:tcPr>
+            <w:tcW w:type="dxa" w:w="4513"/>
+          </w:tcPr>
+          <w:p>
+            <w:r>
+              <w:rPr>
+                <w:b/>
+              </w:rPr>
+              <w:t>Bab</w:t>
+            </w:r>
+          </w:p>
+        </w:tc>
+        <w:tc>
+          <w:tcPr>
+            <w:tcW w:type="dxa" w:w="4513"/>
+          </w:tcPr>
+          <w:p>
+            <w:r>
+              <w:rPr>
+                <w:b/>
+              </w:rPr>
+              <w:t>Sub-topik</w:t>
+            </w:r>
+          </w:p>
+        </w:tc>
+      </w:tr>
+      <w:tr>
+        <w:tc>
+          <w:tcPr>
+            <w:tcW w:type="dxa" w:w="4513"/>
+          </w:tcPr>
+          <w:p>
+            <w:r>
+              <w:t>Bab 1: Project Material</w:t>
+            </w:r>
+          </w:p>
+        </w:tc>
+        <w:tc>
+          <w:tcPr>
+            <w:tcW w:type="dxa" w:w="4513"/>
+          </w:tcPr>
+          <w:p>
+            <w:r>
+              <w:t>1. Kategori Format Bahan Projek</w:t>
+              <w:br/>
+              <w:t>2. Kesan Format terhadap Kerja Ingest</w:t>
+              <w:br/>
+              <w:t>3. Kaitan dengan Proses Kerja Syarikat</w:t>
+            </w:r>
+          </w:p>
+        </w:tc>
+      </w:tr>
+      <w:tr>
+        <w:tc>
+          <w:tcPr>
+            <w:tcW w:type="dxa" w:w="4513"/>
+          </w:tcPr>
+          <w:p>
+            <w:r>
+              <w:t>Bab 2: Frame Rate</w:t>
+            </w:r>
+          </w:p>
+        </w:tc>
+        <w:tc>
+          <w:tcPr>
+            <w:tcW w:type="dxa" w:w="4513"/>
+          </w:tcPr>
+          <w:p>
+            <w:r>
+              <w:t>1. Definisi Frame Rate</w:t>
+              <w:br/>
+              <w:t>2. Jenis-jenis Frame Rate (verbatim CoCU)</w:t>
+              <w:br/>
+              <w:t>3. Contoh Isu Praktikal</w:t>
+            </w:r>
+          </w:p>
+        </w:tc>
+      </w:tr>
+      <w:tr>
+        <w:tc>
+          <w:tcPr>
+            <w:tcW w:type="dxa" w:w="4513"/>
+          </w:tcPr>
+          <w:p>
+            <w:r>
+              <w:t>Bab 3: Scanning Lines</w:t>
+            </w:r>
+          </w:p>
+        </w:tc>
+        <w:tc>
+          <w:tcPr>
+            <w:tcW w:type="dxa" w:w="4513"/>
+          </w:tcPr>
+          <w:p>
+            <w:r>
+              <w:t>1. Interlaced (i)</w:t>
+              <w:br/>
+              <w:t>2. Progressive (p)</w:t>
+              <w:br/>
+              <w:t>3. Kesan Pencampuran Tanpa Penukaran Betul</w:t>
+            </w:r>
+          </w:p>
+        </w:tc>
+      </w:tr>
+      <w:tr>
+        <w:tc>
+          <w:tcPr>
+            <w:tcW w:type="dxa" w:w="4513"/>
+          </w:tcPr>
+          <w:p>
+            <w:r>
+              <w:t>Bab 4: Aspect Ratio</w:t>
+            </w:r>
+          </w:p>
+        </w:tc>
+        <w:tc>
+          <w:tcPr>
+            <w:tcW w:type="dxa" w:w="4513"/>
+          </w:tcPr>
+          <w:p>
+            <w:r>
+              <w:t>1. Definisi Aspect Ratio</w:t>
+              <w:br/>
+              <w:t>2. Jenis-jenis Aspect Ratio (verbatim CoCU)</w:t>
+              <w:br/>
+              <w:t>3. Keputusan Konversi Aspect Ratio</w:t>
+            </w:r>
+          </w:p>
+        </w:tc>
+      </w:tr>
+      <w:tr>
+        <w:tc>
+          <w:tcPr>
+            <w:tcW w:type="dxa" w:w="4513"/>
+          </w:tcPr>
+          <w:p>
+            <w:r>
+              <w:t>Bab 5: Frame Dimension</w:t>
+            </w:r>
+          </w:p>
+        </w:tc>
+        <w:tc>
+          <w:tcPr>
+            <w:tcW w:type="dxa" w:w="4513"/>
+          </w:tcPr>
+          <w:p>
+            <w:r>
+              <w:t>1. Definisi Frame Dimension</w:t>
+              <w:br/>
+              <w:t>2. Nilai-nilai Standard (verbatim CoCU)</w:t>
+              <w:br/>
+              <w:t>3. Kaitan dengan Sequence Settings</w:t>
+            </w:r>
+          </w:p>
+        </w:tc>
+      </w:tr>
+    </w:tbl>
     <w:p/>
     <w:p>
-      <w:pPr>
-        <w:pStyle w:val="Heading2"/>
-      </w:pPr>
       <w:r>
-        <w:t>WA4 — Preview footage (IT-072-3:2012-C01-W04)</w:t>
+        <w:rPr>
+          <w:b/>
+          <w:sz w:val="24"/>
+        </w:rPr>
+        <w:t>Aktiviti Kerja 4: Preview footage  (IT-072-3:2012-C01-W04)</w:t>
       </w:r>
     </w:p>
+    <w:p>
+      <w:r>
+        <w:t>Rangka topik (Bab dan sub-topik):</w:t>
+      </w:r>
+    </w:p>
+    <w:tbl>
+      <w:tblPr>
+        <w:tblW w:type="auto" w:w="0"/>
+        <w:tblLook w:firstColumn="1" w:firstRow="1" w:lastColumn="0" w:lastRow="0" w:noHBand="0" w:noVBand="1" w:val="04A0"/>
+      </w:tblPr>
+      <w:tblGrid>
+        <w:gridCol w:w="4513"/>
+        <w:gridCol w:w="4513"/>
+      </w:tblGrid>
+      <w:tr>
+        <w:tc>
+          <w:tcPr>
+            <w:tcW w:type="dxa" w:w="4513"/>
+          </w:tcPr>
+          <w:p>
+            <w:r>
+              <w:rPr>
+                <w:b/>
+              </w:rPr>
+              <w:t>Bab</w:t>
+            </w:r>
+          </w:p>
+        </w:tc>
+        <w:tc>
+          <w:tcPr>
+            <w:tcW w:type="dxa" w:w="4513"/>
+          </w:tcPr>
+          <w:p>
+            <w:r>
+              <w:rPr>
+                <w:b/>
+              </w:rPr>
+              <w:t>Sub-topik</w:t>
+            </w:r>
+          </w:p>
+        </w:tc>
+      </w:tr>
+      <w:tr>
+        <w:tc>
+          <w:tcPr>
+            <w:tcW w:type="dxa" w:w="4513"/>
+          </w:tcPr>
+          <w:p>
+            <w:r>
+              <w:t>Bab 1: Computer Software and Hardware</w:t>
+            </w:r>
+          </w:p>
+        </w:tc>
+        <w:tc>
+          <w:tcPr>
+            <w:tcW w:type="dxa" w:w="4513"/>
+          </w:tcPr>
+          <w:p>
+            <w:r>
+              <w:t>1. Tiga Komponen Utama (verbatim CoCU)</w:t>
+              <w:br/>
+              <w:t>2. Kepentingan Keserasian</w:t>
+            </w:r>
+          </w:p>
+        </w:tc>
+      </w:tr>
+      <w:tr>
+        <w:tc>
+          <w:tcPr>
+            <w:tcW w:type="dxa" w:w="4513"/>
+          </w:tcPr>
+          <w:p>
+            <w:r>
+              <w:t>Bab 2: Type of Material</w:t>
+            </w:r>
+          </w:p>
+        </w:tc>
+        <w:tc>
+          <w:tcPr>
+            <w:tcW w:type="dxa" w:w="4513"/>
+          </w:tcPr>
+          <w:p>
+            <w:r>
+              <w:t>1. Tiga Kategori Jenis Bahan (verbatim CoCU)</w:t>
+              <w:br/>
+              <w:t>2. Perbezaan Kaedah Pratonton</w:t>
+            </w:r>
+          </w:p>
+        </w:tc>
+      </w:tr>
+      <w:tr>
+        <w:tc>
+          <w:tcPr>
+            <w:tcW w:type="dxa" w:w="4513"/>
+          </w:tcPr>
+          <w:p>
+            <w:r>
+              <w:t>Bab 3: Required Shot</w:t>
+            </w:r>
+          </w:p>
+        </w:tc>
+        <w:tc>
+          <w:tcPr>
+            <w:tcW w:type="dxa" w:w="4513"/>
+          </w:tcPr>
+          <w:p>
+            <w:r>
+              <w:t>1. Good Takes</w:t>
+              <w:br/>
+              <w:t>2. KIV Takes (Keep In View)</w:t>
+              <w:br/>
+              <w:t>3. Pengurusan Bin</w:t>
+            </w:r>
+          </w:p>
+        </w:tc>
+      </w:tr>
+      <w:tr>
+        <w:tc>
+          <w:tcPr>
+            <w:tcW w:type="dxa" w:w="4513"/>
+          </w:tcPr>
+          <w:p>
+            <w:r>
+              <w:t>Bab 4: Footage Format Conversion</w:t>
+            </w:r>
+          </w:p>
+        </w:tc>
+        <w:tc>
+          <w:tcPr>
+            <w:tcW w:type="dxa" w:w="4513"/>
+          </w:tcPr>
+          <w:p>
+            <w:r>
+              <w:t>1. Jenis-jenis Konversi (verbatim CoCU)</w:t>
+              <w:br/>
+              <w:t>2. Kepentingan Perancangan Awal</w:t>
+            </w:r>
+          </w:p>
+        </w:tc>
+      </w:tr>
+      <w:tr>
+        <w:tc>
+          <w:tcPr>
+            <w:tcW w:type="dxa" w:w="4513"/>
+          </w:tcPr>
+          <w:p>
+            <w:r>
+              <w:t>Bab 5: Continuity Sheet</w:t>
+            </w:r>
+          </w:p>
+        </w:tc>
+        <w:tc>
+          <w:tcPr>
+            <w:tcW w:type="dxa" w:w="4513"/>
+          </w:tcPr>
+          <w:p>
+            <w:r>
+              <w:t>1. Definisi dan Kandungan</w:t>
+              <w:br/>
+              <w:t>2. Kegunaan Semasa Pratonton</w:t>
+              <w:br/>
+              <w:t>3. Kaitan dengan Proses Kerja Syarikat</w:t>
+            </w:r>
+          </w:p>
+        </w:tc>
+      </w:tr>
+    </w:tbl>
     <w:p/>
     <w:p>
-      <w:pPr>
-        <w:pStyle w:val="Heading2"/>
-      </w:pPr>
       <w:r>
-        <w:t>WA5 — Produce project workflow (IT-072-3:2012-C01-W05)</w:t>
+        <w:rPr>
+          <w:b/>
+          <w:sz w:val="24"/>
+        </w:rPr>
+        <w:t>Aktiviti Kerja 5: Produce project workflow  (IT-072-3:2012-C01-W05)</w:t>
       </w:r>
     </w:p>
+    <w:p>
+      <w:r>
+        <w:t>Rangka topik (Bab dan sub-topik):</w:t>
+      </w:r>
+    </w:p>
+    <w:tbl>
+      <w:tblPr>
+        <w:tblW w:type="auto" w:w="0"/>
+        <w:tblLook w:firstColumn="1" w:firstRow="1" w:lastColumn="0" w:lastRow="0" w:noHBand="0" w:noVBand="1" w:val="04A0"/>
+      </w:tblPr>
+      <w:tblGrid>
+        <w:gridCol w:w="4513"/>
+        <w:gridCol w:w="4513"/>
+      </w:tblGrid>
+      <w:tr>
+        <w:tc>
+          <w:tcPr>
+            <w:tcW w:type="dxa" w:w="4513"/>
+          </w:tcPr>
+          <w:p>
+            <w:r>
+              <w:rPr>
+                <w:b/>
+              </w:rPr>
+              <w:t>Bab</w:t>
+            </w:r>
+          </w:p>
+        </w:tc>
+        <w:tc>
+          <w:tcPr>
+            <w:tcW w:type="dxa" w:w="4513"/>
+          </w:tcPr>
+          <w:p>
+            <w:r>
+              <w:rPr>
+                <w:b/>
+              </w:rPr>
+              <w:t>Sub-topik</w:t>
+            </w:r>
+          </w:p>
+        </w:tc>
+      </w:tr>
+      <w:tr>
+        <w:tc>
+          <w:tcPr>
+            <w:tcW w:type="dxa" w:w="4513"/>
+          </w:tcPr>
+          <w:p>
+            <w:r>
+              <w:t>Bab 1: Offline Editing Process</w:t>
+            </w:r>
+          </w:p>
+        </w:tc>
+        <w:tc>
+          <w:tcPr>
+            <w:tcW w:type="dxa" w:w="4513"/>
+          </w:tcPr>
+          <w:p>
+            <w:r>
+              <w:t>1. Definisi Offline Editing</w:t>
+              <w:br/>
+              <w:t>2. Peringkat-peringkat Proses Offline</w:t>
+            </w:r>
+          </w:p>
+        </w:tc>
+      </w:tr>
+      <w:tr>
+        <w:tc>
+          <w:tcPr>
+            <w:tcW w:type="dxa" w:w="4513"/>
+          </w:tcPr>
+          <w:p>
+            <w:r>
+              <w:t>Bab 2: Online Editing Process</w:t>
+            </w:r>
+          </w:p>
+        </w:tc>
+        <w:tc>
+          <w:tcPr>
+            <w:tcW w:type="dxa" w:w="4513"/>
+          </w:tcPr>
+          <w:p>
+            <w:r>
+              <w:t>1. Definisi Online Editing</w:t>
+              <w:br/>
+              <w:t>2. Peringkat-peringkat Proses Online</w:t>
+            </w:r>
+          </w:p>
+        </w:tc>
+      </w:tr>
+      <w:tr>
+        <w:tc>
+          <w:tcPr>
+            <w:tcW w:type="dxa" w:w="4513"/>
+          </w:tcPr>
+          <w:p>
+            <w:r>
+              <w:t>Bab 3: Project Duration</w:t>
+            </w:r>
+          </w:p>
+        </w:tc>
+        <w:tc>
+          <w:tcPr>
+            <w:tcW w:type="dxa" w:w="4513"/>
+          </w:tcPr>
+          <w:p>
+            <w:r>
+              <w:t>1. Daripada Anggaran kepada Pelaksanaan</w:t>
+              <w:br/>
+              <w:t>2. Perincian Tempoh Setiap Fasa</w:t>
+            </w:r>
+          </w:p>
+        </w:tc>
+      </w:tr>
+      <w:tr>
+        <w:tc>
+          <w:tcPr>
+            <w:tcW w:type="dxa" w:w="4513"/>
+          </w:tcPr>
+          <w:p>
+            <w:r>
+              <w:t>Bab 4: Working Schedule</w:t>
+            </w:r>
+          </w:p>
+        </w:tc>
+        <w:tc>
+          <w:tcPr>
+            <w:tcW w:type="dxa" w:w="4513"/>
+          </w:tcPr>
+          <w:p>
+            <w:r>
+              <w:t>1. Definisi Jadual Kerja</w:t>
+              <w:br/>
+              <w:t>2. Langkah Menyediakan Jadual Kerja</w:t>
+            </w:r>
+          </w:p>
+        </w:tc>
+      </w:tr>
+    </w:tbl>
     <w:p/>
     <w:sectPr>
       <w:pgSz w:w="11906" w:h="16838"/>
@@ -225,801 +1139,6 @@
       <w:cols w:space="720"/>
       <w:docGrid w:linePitch="360"/>
     </w:sectPr>
-    <w:tbl>
-      <w:tblPr>
-        <w:tblW w:w="5000" w:type="pct"/>
-        <w:tblBorders>
-          <w:top w:val="single" w:sz="4" w:space="0" w:color="auto"/>
-          <w:left w:val="single" w:sz="4" w:space="0" w:color="auto"/>
-          <w:bottom w:val="single" w:sz="4" w:space="0" w:color="auto"/>
-          <w:right w:val="single" w:sz="4" w:space="0" w:color="auto"/>
-          <w:insideH w:val="single" w:sz="4" w:space="0" w:color="auto"/>
-          <w:insideV w:val="single" w:sz="4" w:space="0" w:color="auto"/>
-        </w:tblBorders>
-        <w:tblCellMar>
-          <w:left w:w="10" w:type="dxa"/>
-          <w:right w:w="10" w:type="dxa"/>
-        </w:tblCellMar>
-        <w:tblLook w:val="0000" w:firstRow="0" w:lastRow="0" w:firstColumn="0" w:lastColumn="0" w:noHBand="0" w:noVBand="0"/>
-      </w:tblPr>
-      <w:tblGrid>
-        <w:gridCol w:w="9016"/>
-      </w:tblGrid>
-      <w:tr>
-        <w:tc>
-          <w:tcPr>
-            <w:tcW w:w="0" w:type="auto"/>
-            <w:shd w:val="clear" w:color="auto" w:fill="F2F2F2"/>
-            <w:tcMar>
-              <w:top w:w="150" w:type="dxa"/>
-              <w:left w:w="150" w:type="dxa"/>
-              <w:bottom w:w="150" w:type="dxa"/>
-              <w:right w:w="150" w:type="dxa"/>
-            </w:tcMar>
-          </w:tcPr>
-          <w:p>
-            <w:pPr>
-              <w:spacing w:line="360" w:lineRule="auto"/>
-              <w:rPr>
-                <w:rFonts w:ascii="Arial" w:hAnsi="Arial" w:cs="Arial"/>
-                <w:sz w:val="24"/>
-                <w:szCs w:val="24"/>
-              </w:rPr>
-            </w:pPr>
-            <w:r/>
-            <w:r>
-              <w:rPr>
-                <w:b/>
-                <w:sz w:val="21"/>
-              </w:rPr>
-              <w:t>PROMPT CHATGPT/AI</w:t>
-            </w:r>
-          </w:p>
-          <w:p>
-            <w:pPr/>
-            <w:r>
-              <w:rPr>
-                <w:b w:val="0"/>
-                <w:sz w:val="21"/>
-              </w:rPr>
-              <w:t>Syarikat saya [TBD: nama syarikat].</w:t>
-            </w:r>
-          </w:p>
-          <w:p>
-            <w:pPr/>
-            <w:r>
-              <w:rPr>
-                <w:b w:val="0"/>
-                <w:sz w:val="21"/>
-              </w:rPr>
-              <w:t>Syarikat akan menawarkan program IT-072-3:2012 VIDEO / FILM (EDITING) TAHAP 3 kepada pekerja kami yang berkerja sebagai Editor.</w:t>
-            </w:r>
-          </w:p>
-          <w:p>
-            <w:pPr/>
-            <w:r>
-              <w:rPr>
-                <w:b w:val="0"/>
-                <w:sz w:val="21"/>
-              </w:rPr>
-              <w:t>Module: C01 Visual Editing Project Analysis</w:t>
-            </w:r>
-          </w:p>
-          <w:p>
-            <w:pPr/>
-            <w:r>
-              <w:rPr>
-                <w:b w:val="0"/>
-                <w:sz w:val="21"/>
-              </w:rPr>
-              <w:t>Work Activity: WA1 — Analyse visual editing project script (IT-072-3:2012-C01-W01)</w:t>
-            </w:r>
-          </w:p>
-          <w:p>
-            <w:pPr/>
-            <w:r>
-              <w:rPr>
-                <w:b w:val="0"/>
-                <w:sz w:val="21"/>
-              </w:rPr>
-              <w:t>Senarai topik nota yang berkenaan dengan work activity:</w:t>
-            </w:r>
-          </w:p>
-          <w:p>
-            <w:pPr/>
-            <w:r>
-              <w:rPr>
-                <w:b w:val="0"/>
-                <w:sz w:val="21"/>
-              </w:rPr>
-              <w:t>1 Types of script</w:t>
-            </w:r>
-          </w:p>
-          <w:p>
-            <w:pPr/>
-            <w:r>
-              <w:rPr>
-                <w:b w:val="0"/>
-                <w:sz w:val="21"/>
-              </w:rPr>
-              <w:t>2 Project concept (Storyline, Message, Theme, Genre)</w:t>
-            </w:r>
-          </w:p>
-          <w:p>
-            <w:pPr/>
-            <w:r>
-              <w:rPr>
-                <w:b w:val="0"/>
-                <w:sz w:val="21"/>
-              </w:rPr>
-              <w:t>3 Type of audio (Dialogue, Voice Over, Music, Ambience)</w:t>
-            </w:r>
-          </w:p>
-          <w:p>
-            <w:pPr/>
-            <w:r>
-              <w:rPr>
-                <w:b w:val="0"/>
-                <w:sz w:val="21"/>
-              </w:rPr>
-              <w:t>4 Type of language version (Single/Bi/Multi language)</w:t>
-            </w:r>
-          </w:p>
-          <w:p>
-            <w:pPr/>
-            <w:r>
-              <w:rPr>
-                <w:b w:val="0"/>
-                <w:sz w:val="21"/>
-              </w:rPr>
-              <w:t>5 Project media output (Web, Tape, Film, Hardisk, DVD/Blu-ray, 3D Stereoscopic)</w:t>
-            </w:r>
-          </w:p>
-          <w:p>
-            <w:pPr/>
-            <w:r>
-              <w:rPr>
-                <w:b w:val="0"/>
-                <w:sz w:val="21"/>
-              </w:rPr>
-              <w:t>6 Project duration (Script requirement, Man hour requirement, Machine availability)</w:t>
-            </w:r>
-          </w:p>
-          <w:p>
-            <w:pPr/>
-            <w:r>
-              <w:rPr>
-                <w:b w:val="0"/>
-                <w:sz w:val="21"/>
-              </w:rPr>
-              <w:t>7 Editing technique in theory (Continuity cut, Jump cut, Parallel cut, Cross cut, Slow cut, Fast cut, Elliptical cut, Montage, Overlapping editing, Transition, Rhythmic editing, Graphical editing, Temporal editing, Spatial editing)</w:t>
-            </w:r>
-          </w:p>
-        </w:tc>
-      </w:tr>
-    </w:tbl>
-    <w:tbl>
-      <w:tblPr>
-        <w:tblW w:w="5000" w:type="pct"/>
-        <w:tblBorders>
-          <w:top w:val="single" w:sz="4" w:space="0" w:color="auto"/>
-          <w:left w:val="single" w:sz="4" w:space="0" w:color="auto"/>
-          <w:bottom w:val="single" w:sz="4" w:space="0" w:color="auto"/>
-          <w:right w:val="single" w:sz="4" w:space="0" w:color="auto"/>
-          <w:insideH w:val="single" w:sz="4" w:space="0" w:color="auto"/>
-          <w:insideV w:val="single" w:sz="4" w:space="0" w:color="auto"/>
-        </w:tblBorders>
-        <w:tblCellMar>
-          <w:left w:w="10" w:type="dxa"/>
-          <w:right w:w="10" w:type="dxa"/>
-        </w:tblCellMar>
-        <w:tblLook w:val="0000" w:firstRow="0" w:lastRow="0" w:firstColumn="0" w:lastColumn="0" w:noHBand="0" w:noVBand="0"/>
-      </w:tblPr>
-      <w:tblGrid>
-        <w:gridCol w:w="9016"/>
-      </w:tblGrid>
-      <w:tr>
-        <w:tc>
-          <w:tcPr>
-            <w:tcW w:w="0" w:type="auto"/>
-            <w:shd w:val="clear" w:color="auto" w:fill="F2F2F2"/>
-            <w:tcMar>
-              <w:top w:w="150" w:type="dxa"/>
-              <w:left w:w="150" w:type="dxa"/>
-              <w:bottom w:w="150" w:type="dxa"/>
-              <w:right w:w="150" w:type="dxa"/>
-            </w:tcMar>
-          </w:tcPr>
-          <w:p>
-            <w:pPr>
-              <w:spacing w:line="360" w:lineRule="auto"/>
-              <w:rPr>
-                <w:rFonts w:ascii="Arial" w:hAnsi="Arial" w:cs="Arial"/>
-                <w:sz w:val="24"/>
-                <w:szCs w:val="24"/>
-              </w:rPr>
-            </w:pPr>
-            <w:r/>
-            <w:r>
-              <w:rPr>
-                <w:b/>
-                <w:sz w:val="21"/>
-              </w:rPr>
-              <w:t>PROMPT CHATGPT/AI</w:t>
-            </w:r>
-          </w:p>
-          <w:p>
-            <w:pPr/>
-            <w:r>
-              <w:rPr>
-                <w:b w:val="0"/>
-                <w:sz w:val="21"/>
-              </w:rPr>
-              <w:t>Syarikat saya [TBD: nama syarikat].</w:t>
-            </w:r>
-          </w:p>
-          <w:p>
-            <w:pPr/>
-            <w:r>
-              <w:rPr>
-                <w:b w:val="0"/>
-                <w:sz w:val="21"/>
-              </w:rPr>
-              <w:t>Syarikat akan menawarkan program IT-072-3:2012 VIDEO / FILM (EDITING) TAHAP 3 kepada pekerja kami yang berkerja sebagai Editor.</w:t>
-            </w:r>
-          </w:p>
-          <w:p>
-            <w:pPr/>
-            <w:r>
-              <w:rPr>
-                <w:b w:val="0"/>
-                <w:sz w:val="21"/>
-              </w:rPr>
-              <w:t>Module: C01 Visual Editing Project Analysis</w:t>
-            </w:r>
-          </w:p>
-          <w:p>
-            <w:pPr/>
-            <w:r>
-              <w:rPr>
-                <w:b w:val="0"/>
-                <w:sz w:val="21"/>
-              </w:rPr>
-              <w:t>Work Activity: WA2 — Analyse visual editing project concept (IT-072-3:2012-C01-W02)</w:t>
-            </w:r>
-          </w:p>
-          <w:p>
-            <w:pPr/>
-            <w:r>
-              <w:rPr>
-                <w:b w:val="0"/>
-                <w:sz w:val="21"/>
-              </w:rPr>
-              <w:t>Senarai topik nota yang berkenaan dengan work activity:</w:t>
-            </w:r>
-          </w:p>
-          <w:p>
-            <w:pPr/>
-            <w:r>
-              <w:rPr>
-                <w:b w:val="0"/>
-                <w:sz w:val="21"/>
-              </w:rPr>
-              <w:t>1 Category of genre (Action, Adventure, Comedy, Crime, Documentary, Fantasy, Historical, Horror, Mystery, dll.)</w:t>
-            </w:r>
-          </w:p>
-          <w:p>
-            <w:pPr/>
-            <w:r>
-              <w:rPr>
-                <w:b w:val="0"/>
-                <w:sz w:val="21"/>
-              </w:rPr>
-              <w:t>2 Types of genre — sub-genre penuh ikut kategori (Comedy, Action, Adventure, Crime, Documentary, Fantasy, Historical, Horror, Mystery, Paranoid, Philosophical, Political, Romance, Saga, Satire, Science fiction, Slice of life, Speculative, Thriller, Urban)</w:t>
-            </w:r>
-          </w:p>
-          <w:p>
-            <w:pPr/>
-            <w:r>
-              <w:rPr>
-                <w:b w:val="0"/>
-                <w:sz w:val="21"/>
-              </w:rPr>
-              <w:t>3 Category of theme (Life, Society, Human nature)</w:t>
-            </w:r>
-          </w:p>
-          <w:p>
-            <w:pPr/>
-            <w:r>
-              <w:rPr>
-                <w:b w:val="0"/>
-                <w:sz w:val="21"/>
-              </w:rPr>
-              <w:t>4 Visual effect (VFX) elements (concept design, creation, digital art assets, animation)</w:t>
-            </w:r>
-          </w:p>
-          <w:p>
-            <w:pPr/>
-            <w:r>
-              <w:rPr>
-                <w:b w:val="0"/>
-                <w:sz w:val="21"/>
-              </w:rPr>
-              <w:t>5 Sound effect (Hard sound, Background sound, Foley sound, Sound design)</w:t>
-            </w:r>
-          </w:p>
-          <w:p>
-            <w:pPr/>
-            <w:r>
-              <w:rPr>
-                <w:b w:val="0"/>
-                <w:sz w:val="21"/>
-              </w:rPr>
-              <w:t>6 Background music (Antecedents, Incidental, Furniture, Elevator, Ambient, Foreground)</w:t>
-            </w:r>
-          </w:p>
-          <w:p>
-            <w:pPr/>
-            <w:r>
-              <w:rPr>
-                <w:b w:val="0"/>
-                <w:sz w:val="21"/>
-              </w:rPr>
-              <w:t>7 Visualise editing technique (sama senarai teknik seperti WA1, digunakan dalam konteks konsep kreatif)</w:t>
-            </w:r>
-          </w:p>
-        </w:tc>
-      </w:tr>
-    </w:tbl>
-    <w:tbl>
-      <w:tblPr>
-        <w:tblW w:w="5000" w:type="pct"/>
-        <w:tblBorders>
-          <w:top w:val="single" w:sz="4" w:space="0" w:color="auto"/>
-          <w:left w:val="single" w:sz="4" w:space="0" w:color="auto"/>
-          <w:bottom w:val="single" w:sz="4" w:space="0" w:color="auto"/>
-          <w:right w:val="single" w:sz="4" w:space="0" w:color="auto"/>
-          <w:insideH w:val="single" w:sz="4" w:space="0" w:color="auto"/>
-          <w:insideV w:val="single" w:sz="4" w:space="0" w:color="auto"/>
-        </w:tblBorders>
-        <w:tblCellMar>
-          <w:left w:w="10" w:type="dxa"/>
-          <w:right w:w="10" w:type="dxa"/>
-        </w:tblCellMar>
-        <w:tblLook w:val="0000" w:firstRow="0" w:lastRow="0" w:firstColumn="0" w:lastColumn="0" w:noHBand="0" w:noVBand="0"/>
-      </w:tblPr>
-      <w:tblGrid>
-        <w:gridCol w:w="9016"/>
-      </w:tblGrid>
-      <w:tr>
-        <w:tc>
-          <w:tcPr>
-            <w:tcW w:w="0" w:type="auto"/>
-            <w:shd w:val="clear" w:color="auto" w:fill="F2F2F2"/>
-            <w:tcMar>
-              <w:top w:w="150" w:type="dxa"/>
-              <w:left w:w="150" w:type="dxa"/>
-              <w:bottom w:w="150" w:type="dxa"/>
-              <w:right w:w="150" w:type="dxa"/>
-            </w:tcMar>
-          </w:tcPr>
-          <w:p>
-            <w:pPr>
-              <w:spacing w:line="360" w:lineRule="auto"/>
-              <w:rPr>
-                <w:rFonts w:ascii="Arial" w:hAnsi="Arial" w:cs="Arial"/>
-                <w:sz w:val="24"/>
-                <w:szCs w:val="24"/>
-              </w:rPr>
-            </w:pPr>
-            <w:r/>
-            <w:r>
-              <w:rPr>
-                <w:b/>
-                <w:sz w:val="21"/>
-              </w:rPr>
-              <w:t>PROMPT CHATGPT/AI</w:t>
-            </w:r>
-          </w:p>
-          <w:p>
-            <w:pPr/>
-            <w:r>
-              <w:rPr>
-                <w:b w:val="0"/>
-                <w:sz w:val="21"/>
-              </w:rPr>
-              <w:t>Syarikat saya [TBD: nama syarikat].</w:t>
-            </w:r>
-          </w:p>
-          <w:p>
-            <w:pPr/>
-            <w:r>
-              <w:rPr>
-                <w:b w:val="0"/>
-                <w:sz w:val="21"/>
-              </w:rPr>
-              <w:t>Syarikat akan menawarkan program IT-072-3:2012 VIDEO / FILM (EDITING) TAHAP 3 kepada pekerja kami yang berkerja sebagai Editor.</w:t>
-            </w:r>
-          </w:p>
-          <w:p>
-            <w:pPr/>
-            <w:r>
-              <w:rPr>
-                <w:b w:val="0"/>
-                <w:sz w:val="21"/>
-              </w:rPr>
-              <w:t>Module: C01 Visual Editing Project Analysis</w:t>
-            </w:r>
-          </w:p>
-          <w:p>
-            <w:pPr/>
-            <w:r>
-              <w:rPr>
-                <w:b w:val="0"/>
-                <w:sz w:val="21"/>
-              </w:rPr>
-              <w:t>Work Activity: WA3 — Classify visual editing format and sources (IT-072-3:2012-C01-W03)</w:t>
-            </w:r>
-          </w:p>
-          <w:p>
-            <w:pPr/>
-            <w:r>
-              <w:rPr>
-                <w:b w:val="0"/>
-                <w:sz w:val="21"/>
-              </w:rPr>
-              <w:t>Senarai topik nota yang berkenaan dengan work activity:</w:t>
-            </w:r>
-          </w:p>
-          <w:p>
-            <w:pPr/>
-            <w:r>
-              <w:rPr>
-                <w:b w:val="0"/>
-                <w:sz w:val="21"/>
-              </w:rPr>
-              <w:t>1 Project material (Tape, High Definition, Film, Stills/graphic, Tapeless Format, Archive)</w:t>
-            </w:r>
-          </w:p>
-          <w:p>
-            <w:pPr/>
-            <w:r>
-              <w:rPr>
-                <w:b w:val="0"/>
-                <w:sz w:val="21"/>
-              </w:rPr>
-              <w:t>2 Frame rate (24fps, 25fps, 50i, 29.97, 30fps, 23.976, 60i, HD Universal Timecode)</w:t>
-            </w:r>
-          </w:p>
-          <w:p>
-            <w:pPr/>
-            <w:r>
-              <w:rPr>
-                <w:b w:val="0"/>
-                <w:sz w:val="21"/>
-              </w:rPr>
-              <w:t>3 Scanning lines (Interlaced, Progressive)</w:t>
-            </w:r>
-          </w:p>
-          <w:p>
-            <w:pPr/>
-            <w:r>
-              <w:rPr>
-                <w:b w:val="0"/>
-                <w:sz w:val="21"/>
-              </w:rPr>
-              <w:t>4 Aspect ratio (4:3, 14:9, 16:9, Cinemascope, Anamorphic, Flat screen, Letter box, Pillar box, Wide screen)</w:t>
-            </w:r>
-          </w:p>
-          <w:p>
-            <w:pPr/>
-            <w:r>
-              <w:rPr>
-                <w:b w:val="0"/>
-                <w:sz w:val="21"/>
-              </w:rPr>
-              <w:t>5 Frame Dimension (1920x1080, 1440x1080, 1270x720, 720x576, 720x480)</w:t>
-            </w:r>
-          </w:p>
-        </w:tc>
-      </w:tr>
-    </w:tbl>
-    <w:tbl>
-      <w:tblPr>
-        <w:tblW w:w="5000" w:type="pct"/>
-        <w:tblBorders>
-          <w:top w:val="single" w:sz="4" w:space="0" w:color="auto"/>
-          <w:left w:val="single" w:sz="4" w:space="0" w:color="auto"/>
-          <w:bottom w:val="single" w:sz="4" w:space="0" w:color="auto"/>
-          <w:right w:val="single" w:sz="4" w:space="0" w:color="auto"/>
-          <w:insideH w:val="single" w:sz="4" w:space="0" w:color="auto"/>
-          <w:insideV w:val="single" w:sz="4" w:space="0" w:color="auto"/>
-        </w:tblBorders>
-        <w:tblCellMar>
-          <w:left w:w="10" w:type="dxa"/>
-          <w:right w:w="10" w:type="dxa"/>
-        </w:tblCellMar>
-        <w:tblLook w:val="0000" w:firstRow="0" w:lastRow="0" w:firstColumn="0" w:lastColumn="0" w:noHBand="0" w:noVBand="0"/>
-      </w:tblPr>
-      <w:tblGrid>
-        <w:gridCol w:w="9016"/>
-      </w:tblGrid>
-      <w:tr>
-        <w:tc>
-          <w:tcPr>
-            <w:tcW w:w="0" w:type="auto"/>
-            <w:shd w:val="clear" w:color="auto" w:fill="F2F2F2"/>
-            <w:tcMar>
-              <w:top w:w="150" w:type="dxa"/>
-              <w:left w:w="150" w:type="dxa"/>
-              <w:bottom w:w="150" w:type="dxa"/>
-              <w:right w:w="150" w:type="dxa"/>
-            </w:tcMar>
-          </w:tcPr>
-          <w:p>
-            <w:pPr>
-              <w:spacing w:line="360" w:lineRule="auto"/>
-              <w:rPr>
-                <w:rFonts w:ascii="Arial" w:hAnsi="Arial" w:cs="Arial"/>
-                <w:sz w:val="24"/>
-                <w:szCs w:val="24"/>
-              </w:rPr>
-            </w:pPr>
-            <w:r/>
-            <w:r>
-              <w:rPr>
-                <w:b/>
-                <w:sz w:val="21"/>
-              </w:rPr>
-              <w:t>PROMPT CHATGPT/AI</w:t>
-            </w:r>
-          </w:p>
-          <w:p>
-            <w:pPr/>
-            <w:r>
-              <w:rPr>
-                <w:b w:val="0"/>
-                <w:sz w:val="21"/>
-              </w:rPr>
-              <w:t>Syarikat saya [TBD: nama syarikat].</w:t>
-            </w:r>
-          </w:p>
-          <w:p>
-            <w:pPr/>
-            <w:r>
-              <w:rPr>
-                <w:b w:val="0"/>
-                <w:sz w:val="21"/>
-              </w:rPr>
-              <w:t>Syarikat akan menawarkan program IT-072-3:2012 VIDEO / FILM (EDITING) TAHAP 3 kepada pekerja kami yang berkerja sebagai Editor.</w:t>
-            </w:r>
-          </w:p>
-          <w:p>
-            <w:pPr/>
-            <w:r>
-              <w:rPr>
-                <w:b w:val="0"/>
-                <w:sz w:val="21"/>
-              </w:rPr>
-              <w:t>Module: C01 Visual Editing Project Analysis</w:t>
-            </w:r>
-          </w:p>
-          <w:p>
-            <w:pPr/>
-            <w:r>
-              <w:rPr>
-                <w:b w:val="0"/>
-                <w:sz w:val="21"/>
-              </w:rPr>
-              <w:t>Work Activity: WA4 — Preview footage (IT-072-3:2012-C01-W04)</w:t>
-            </w:r>
-          </w:p>
-          <w:p>
-            <w:pPr/>
-            <w:r>
-              <w:rPr>
-                <w:b w:val="0"/>
-                <w:sz w:val="21"/>
-              </w:rPr>
-              <w:t>Senarai topik nota yang berkenaan dengan work activity:</w:t>
-            </w:r>
-          </w:p>
-          <w:p>
-            <w:pPr/>
-            <w:r>
-              <w:rPr>
-                <w:b w:val="0"/>
-                <w:sz w:val="21"/>
-              </w:rPr>
-              <w:t>1 Computer software and hardware (Application, Codec, Device)</w:t>
-            </w:r>
-          </w:p>
-          <w:p>
-            <w:pPr/>
-            <w:r>
-              <w:rPr>
-                <w:b w:val="0"/>
-                <w:sz w:val="21"/>
-              </w:rPr>
-              <w:t>2 Type of material (Tape, Data SD/HD, Film)</w:t>
-            </w:r>
-          </w:p>
-          <w:p>
-            <w:pPr/>
-            <w:r>
-              <w:rPr>
-                <w:b w:val="0"/>
-                <w:sz w:val="21"/>
-              </w:rPr>
-              <w:t>3 Required shot (Good takes, KIV takes)</w:t>
-            </w:r>
-          </w:p>
-          <w:p>
-            <w:pPr/>
-            <w:r>
-              <w:rPr>
-                <w:b w:val="0"/>
-                <w:sz w:val="21"/>
-              </w:rPr>
-              <w:t>4 Footage format conversion (Up conversion, Down conversion, Frame Rate Conversion)</w:t>
-            </w:r>
-          </w:p>
-          <w:p>
-            <w:pPr/>
-            <w:r>
-              <w:rPr>
-                <w:b w:val="0"/>
-                <w:sz w:val="21"/>
-              </w:rPr>
-              <w:t>5 Continuity sheet</w:t>
-            </w:r>
-          </w:p>
-        </w:tc>
-      </w:tr>
-    </w:tbl>
-    <w:tbl>
-      <w:tblPr>
-        <w:tblW w:w="5000" w:type="pct"/>
-        <w:tblBorders>
-          <w:top w:val="single" w:sz="4" w:space="0" w:color="auto"/>
-          <w:left w:val="single" w:sz="4" w:space="0" w:color="auto"/>
-          <w:bottom w:val="single" w:sz="4" w:space="0" w:color="auto"/>
-          <w:right w:val="single" w:sz="4" w:space="0" w:color="auto"/>
-          <w:insideH w:val="single" w:sz="4" w:space="0" w:color="auto"/>
-          <w:insideV w:val="single" w:sz="4" w:space="0" w:color="auto"/>
-        </w:tblBorders>
-        <w:tblCellMar>
-          <w:left w:w="10" w:type="dxa"/>
-          <w:right w:w="10" w:type="dxa"/>
-        </w:tblCellMar>
-        <w:tblLook w:val="0000" w:firstRow="0" w:lastRow="0" w:firstColumn="0" w:lastColumn="0" w:noHBand="0" w:noVBand="0"/>
-      </w:tblPr>
-      <w:tblGrid>
-        <w:gridCol w:w="9016"/>
-      </w:tblGrid>
-      <w:tr>
-        <w:tc>
-          <w:tcPr>
-            <w:tcW w:w="0" w:type="auto"/>
-            <w:shd w:val="clear" w:color="auto" w:fill="F2F2F2"/>
-            <w:tcMar>
-              <w:top w:w="150" w:type="dxa"/>
-              <w:left w:w="150" w:type="dxa"/>
-              <w:bottom w:w="150" w:type="dxa"/>
-              <w:right w:w="150" w:type="dxa"/>
-            </w:tcMar>
-          </w:tcPr>
-          <w:p>
-            <w:pPr>
-              <w:spacing w:line="360" w:lineRule="auto"/>
-              <w:rPr>
-                <w:rFonts w:ascii="Arial" w:hAnsi="Arial" w:cs="Arial"/>
-                <w:sz w:val="24"/>
-                <w:szCs w:val="24"/>
-              </w:rPr>
-            </w:pPr>
-            <w:r/>
-            <w:r>
-              <w:rPr>
-                <w:b/>
-                <w:sz w:val="21"/>
-              </w:rPr>
-              <w:t>PROMPT CHATGPT/AI</w:t>
-            </w:r>
-          </w:p>
-          <w:p>
-            <w:pPr/>
-            <w:r>
-              <w:rPr>
-                <w:b w:val="0"/>
-                <w:sz w:val="21"/>
-              </w:rPr>
-              <w:t>Syarikat saya [TBD: nama syarikat].</w:t>
-            </w:r>
-          </w:p>
-          <w:p>
-            <w:pPr/>
-            <w:r>
-              <w:rPr>
-                <w:b w:val="0"/>
-                <w:sz w:val="21"/>
-              </w:rPr>
-              <w:t>Syarikat akan menawarkan program IT-072-3:2012 VIDEO / FILM (EDITING) TAHAP 3 kepada pekerja kami yang berkerja sebagai Editor.</w:t>
-            </w:r>
-          </w:p>
-          <w:p>
-            <w:pPr/>
-            <w:r>
-              <w:rPr>
-                <w:b w:val="0"/>
-                <w:sz w:val="21"/>
-              </w:rPr>
-              <w:t>Module: C01 Visual Editing Project Analysis</w:t>
-            </w:r>
-          </w:p>
-          <w:p>
-            <w:pPr/>
-            <w:r>
-              <w:rPr>
-                <w:b w:val="0"/>
-                <w:sz w:val="21"/>
-              </w:rPr>
-              <w:t>Work Activity: WA5 — Produce project workflow (IT-072-3:2012-C01-W05)</w:t>
-            </w:r>
-          </w:p>
-          <w:p>
-            <w:pPr/>
-            <w:r>
-              <w:rPr>
-                <w:b w:val="0"/>
-                <w:sz w:val="21"/>
-              </w:rPr>
-              <w:t>Senarai topik nota yang berkenaan dengan work activity:</w:t>
-            </w:r>
-          </w:p>
-          <w:p>
-            <w:pPr/>
-            <w:r>
-              <w:rPr>
-                <w:b w:val="0"/>
-                <w:sz w:val="21"/>
-              </w:rPr>
-              <w:t>1 Offline editing process</w:t>
-            </w:r>
-          </w:p>
-          <w:p>
-            <w:pPr/>
-            <w:r>
-              <w:rPr>
-                <w:b w:val="0"/>
-                <w:sz w:val="21"/>
-              </w:rPr>
-              <w:t>2 Online editing process</w:t>
-            </w:r>
-          </w:p>
-          <w:p>
-            <w:pPr/>
-            <w:r>
-              <w:rPr>
-                <w:b w:val="0"/>
-                <w:sz w:val="21"/>
-              </w:rPr>
-              <w:t>3 Project duration</w:t>
-            </w:r>
-          </w:p>
-          <w:p>
-            <w:pPr/>
-            <w:r>
-              <w:rPr>
-                <w:b w:val="0"/>
-                <w:sz w:val="21"/>
-              </w:rPr>
-              <w:t>4 Working schedule</w:t>
-            </w:r>
-          </w:p>
-        </w:tc>
-      </w:tr>
-    </w:tbl>
   </w:body>
 </w:document>
 </file>

</xml_diff>

<commit_message>
style(output): readability polish (fonts, spacing, tables, xlsx widths) with zero text changes; CA Soalan JPK PDFs re-exported
104 generated docx + 14 JPK-format Soalan polished per _tools/READABILITY-SPEC.md (Arial 11, 1.15 spacing, bold section labels, Table Grid with shaded headers); before/after text dumps identical for every file. 5 xlsx: header styling, wrap, widths, freeze panes; values and formulas unchanged (Lampiran 5 still 6 sheets / 2,523 formulas). Buku Teks PDFs regenerated (164 pp CU book, 347 pp CA book). Soalan JPK: MENGANDUNGI page counts re-patched (6/5) and PDFs re-exported. Added _tools/Export-Pdf.ps1 (one Word process per file — robust against COM RPC drops).

Co-Authored-By: Claude Opus 5 <noreply@anthropic.com>
</commit_message>
<xml_diff>
--- a/video-film-editing/output/04 3.3a Rangka Nota Pembelajaran/3.3a-01 Rangka Nota Pembelajaran C01 VISUAL EDITING PROJECT ANALYSIS (IT-072).docx
+++ b/video-film-editing/output/04 3.3a Rangka Nota Pembelajaran/3.3a-01 Rangka Nota Pembelajaran C01 VISUAL EDITING PROJECT ANALYSIS (IT-072).docx
@@ -5,7 +5,8 @@
     <w:p>
       <w:pPr>
         <w:pStyle w:val="Title"/>
-        <w:spacing w:line="360" w:lineRule="auto"/>
+        <w:spacing w:line="276" w:lineRule="auto" w:after="120"/>
+        <w:jc w:val="left"/>
         <w:rPr>
           <w:rFonts w:ascii="Arial" w:hAnsi="Arial" w:cs="Arial"/>
           <w:sz w:val="24"/>
@@ -18,7 +19,8 @@
           <w:rFonts w:ascii="Arial" w:hAnsi="Arial" w:cs="Arial"/>
           <w:b/>
           <w:bCs/>
-          <w:sz w:val="24"/>
+          <w:color w:val="000000"/>
+          <w:sz w:val="22"/>
           <w:szCs w:val="24"/>
           <w:lang w:val="pt-BR"/>
         </w:rPr>
@@ -28,6 +30,7 @@
     <w:tbl>
       <w:tblPr>
         <w:tblW w:type="auto" w:w="0"/>
+        <w:tblLayout w:type="autofit"/>
         <w:tblLook w:firstColumn="1" w:firstRow="1" w:lastColumn="0" w:lastRow="0" w:noHBand="0" w:noVBand="1" w:val="04A0"/>
         <w:tblBorders>
           <w:top w:val="single" w:sz="4" w:space="0" w:color="000000"/>
@@ -46,15 +49,36 @@
         <w:gridCol w:w="1805"/>
       </w:tblGrid>
       <w:tr>
+        <w:trPr>
+          <w:tblHeader w:val="true"/>
+          <w:cantSplit w:val="true"/>
+        </w:trPr>
         <w:tc>
           <w:tcPr>
             <w:tcW w:type="dxa" w:w="1805"/>
-          </w:tcPr>
-          <w:p>
-            <w:r/>
-            <w:r>
-              <w:rPr>
+            <w:tcMar>
+              <w:top w:w="57" w:type="dxa"/>
+              <w:left w:w="57" w:type="dxa"/>
+              <w:bottom w:w="57" w:type="dxa"/>
+              <w:right w:w="57" w:type="dxa"/>
+            </w:tcMar>
+            <w:shd w:val="clear" w:color="auto" w:fill="D9D9D9"/>
+          </w:tcPr>
+          <w:p>
+            <w:r>
+              <w:rPr>
+                <w:rFonts w:ascii="Arial" w:hAnsi="Arial" w:cs="Arial"/>
                 <w:b/>
+                <w:color w:val="000000"/>
+                <w:sz w:val="20"/>
+              </w:rPr>
+            </w:r>
+            <w:r>
+              <w:rPr>
+                <w:rFonts w:ascii="Arial" w:hAnsi="Arial" w:cs="Arial"/>
+                <w:b/>
+                <w:color w:val="000000"/>
+                <w:sz w:val="20"/>
               </w:rPr>
               <w:t>Kod Program</w:t>
             </w:r>
@@ -63,12 +87,29 @@
         <w:tc>
           <w:tcPr>
             <w:tcW w:type="dxa" w:w="1805"/>
-          </w:tcPr>
-          <w:p>
-            <w:r/>
-            <w:r>
-              <w:rPr>
+            <w:tcMar>
+              <w:top w:w="57" w:type="dxa"/>
+              <w:left w:w="57" w:type="dxa"/>
+              <w:bottom w:w="57" w:type="dxa"/>
+              <w:right w:w="57" w:type="dxa"/>
+            </w:tcMar>
+            <w:shd w:val="clear" w:color="auto" w:fill="D9D9D9"/>
+          </w:tcPr>
+          <w:p>
+            <w:r>
+              <w:rPr>
+                <w:rFonts w:ascii="Arial" w:hAnsi="Arial" w:cs="Arial"/>
                 <w:b/>
+                <w:color w:val="000000"/>
+                <w:sz w:val="20"/>
+              </w:rPr>
+            </w:r>
+            <w:r>
+              <w:rPr>
+                <w:rFonts w:ascii="Arial" w:hAnsi="Arial" w:cs="Arial"/>
+                <w:b/>
+                <w:color w:val="000000"/>
+                <w:sz w:val="20"/>
               </w:rPr>
               <w:t>Tahap</w:t>
             </w:r>
@@ -77,12 +118,29 @@
         <w:tc>
           <w:tcPr>
             <w:tcW w:type="dxa" w:w="1805"/>
-          </w:tcPr>
-          <w:p>
-            <w:r/>
-            <w:r>
-              <w:rPr>
+            <w:tcMar>
+              <w:top w:w="57" w:type="dxa"/>
+              <w:left w:w="57" w:type="dxa"/>
+              <w:bottom w:w="57" w:type="dxa"/>
+              <w:right w:w="57" w:type="dxa"/>
+            </w:tcMar>
+            <w:shd w:val="clear" w:color="auto" w:fill="D9D9D9"/>
+          </w:tcPr>
+          <w:p>
+            <w:r>
+              <w:rPr>
+                <w:rFonts w:ascii="Arial" w:hAnsi="Arial" w:cs="Arial"/>
                 <w:b/>
+                <w:color w:val="000000"/>
+                <w:sz w:val="20"/>
+              </w:rPr>
+            </w:r>
+            <w:r>
+              <w:rPr>
+                <w:rFonts w:ascii="Arial" w:hAnsi="Arial" w:cs="Arial"/>
+                <w:b/>
+                <w:color w:val="000000"/>
+                <w:sz w:val="20"/>
               </w:rPr>
               <w:t>Kod/Nama CU</w:t>
             </w:r>
@@ -91,12 +149,29 @@
         <w:tc>
           <w:tcPr>
             <w:tcW w:type="dxa" w:w="1805"/>
-          </w:tcPr>
-          <w:p>
-            <w:r/>
-            <w:r>
-              <w:rPr>
+            <w:tcMar>
+              <w:top w:w="57" w:type="dxa"/>
+              <w:left w:w="57" w:type="dxa"/>
+              <w:bottom w:w="57" w:type="dxa"/>
+              <w:right w:w="57" w:type="dxa"/>
+            </w:tcMar>
+            <w:shd w:val="clear" w:color="auto" w:fill="D9D9D9"/>
+          </w:tcPr>
+          <w:p>
+            <w:r>
+              <w:rPr>
+                <w:rFonts w:ascii="Arial" w:hAnsi="Arial" w:cs="Arial"/>
                 <w:b/>
+                <w:color w:val="000000"/>
+                <w:sz w:val="20"/>
+              </w:rPr>
+            </w:r>
+            <w:r>
+              <w:rPr>
+                <w:rFonts w:ascii="Arial" w:hAnsi="Arial" w:cs="Arial"/>
+                <w:b/>
+                <w:color w:val="000000"/>
+                <w:sz w:val="20"/>
               </w:rPr>
               <w:t>Bil. WA</w:t>
             </w:r>
@@ -105,12 +180,29 @@
         <w:tc>
           <w:tcPr>
             <w:tcW w:type="dxa" w:w="1805"/>
-          </w:tcPr>
-          <w:p>
-            <w:r/>
-            <w:r>
-              <w:rPr>
+            <w:tcMar>
+              <w:top w:w="57" w:type="dxa"/>
+              <w:left w:w="57" w:type="dxa"/>
+              <w:bottom w:w="57" w:type="dxa"/>
+              <w:right w:w="57" w:type="dxa"/>
+            </w:tcMar>
+            <w:shd w:val="clear" w:color="auto" w:fill="D9D9D9"/>
+          </w:tcPr>
+          <w:p>
+            <w:r>
+              <w:rPr>
+                <w:rFonts w:ascii="Arial" w:hAnsi="Arial" w:cs="Arial"/>
                 <w:b/>
+                <w:color w:val="000000"/>
+                <w:sz w:val="20"/>
+              </w:rPr>
+            </w:r>
+            <w:r>
+              <w:rPr>
+                <w:rFonts w:ascii="Arial" w:hAnsi="Arial" w:cs="Arial"/>
+                <w:b/>
+                <w:color w:val="000000"/>
+                <w:sz w:val="20"/>
               </w:rPr>
               <w:t>Tarikh</w:t>
             </w:r>
@@ -118,13 +210,33 @@
         </w:tc>
       </w:tr>
       <w:tr>
+        <w:trPr>
+          <w:cantSplit w:val="true"/>
+        </w:trPr>
         <w:tc>
           <w:tcPr>
             <w:tcW w:type="dxa" w:w="1805"/>
-          </w:tcPr>
-          <w:p>
-            <w:r/>
-            <w:r>
+            <w:tcMar>
+              <w:top w:w="57" w:type="dxa"/>
+              <w:left w:w="57" w:type="dxa"/>
+              <w:bottom w:w="57" w:type="dxa"/>
+              <w:right w:w="57" w:type="dxa"/>
+            </w:tcMar>
+          </w:tcPr>
+          <w:p>
+            <w:r>
+              <w:rPr>
+                <w:rFonts w:ascii="Arial" w:hAnsi="Arial" w:cs="Arial"/>
+                <w:color w:val="000000"/>
+                <w:sz w:val="20"/>
+              </w:rPr>
+            </w:r>
+            <w:r>
+              <w:rPr>
+                <w:rFonts w:ascii="Arial" w:hAnsi="Arial" w:cs="Arial"/>
+                <w:color w:val="000000"/>
+                <w:sz w:val="20"/>
+              </w:rPr>
               <w:t>IT-072-3:2012</w:t>
             </w:r>
           </w:p>
@@ -132,10 +244,27 @@
         <w:tc>
           <w:tcPr>
             <w:tcW w:type="dxa" w:w="1805"/>
-          </w:tcPr>
-          <w:p>
-            <w:r/>
-            <w:r>
+            <w:tcMar>
+              <w:top w:w="57" w:type="dxa"/>
+              <w:left w:w="57" w:type="dxa"/>
+              <w:bottom w:w="57" w:type="dxa"/>
+              <w:right w:w="57" w:type="dxa"/>
+            </w:tcMar>
+          </w:tcPr>
+          <w:p>
+            <w:r>
+              <w:rPr>
+                <w:rFonts w:ascii="Arial" w:hAnsi="Arial" w:cs="Arial"/>
+                <w:color w:val="000000"/>
+                <w:sz w:val="20"/>
+              </w:rPr>
+            </w:r>
+            <w:r>
+              <w:rPr>
+                <w:rFonts w:ascii="Arial" w:hAnsi="Arial" w:cs="Arial"/>
+                <w:color w:val="000000"/>
+                <w:sz w:val="20"/>
+              </w:rPr>
               <w:t>3</w:t>
             </w:r>
           </w:p>
@@ -143,10 +272,27 @@
         <w:tc>
           <w:tcPr>
             <w:tcW w:type="dxa" w:w="1805"/>
-          </w:tcPr>
-          <w:p>
-            <w:r/>
-            <w:r>
+            <w:tcMar>
+              <w:top w:w="57" w:type="dxa"/>
+              <w:left w:w="57" w:type="dxa"/>
+              <w:bottom w:w="57" w:type="dxa"/>
+              <w:right w:w="57" w:type="dxa"/>
+            </w:tcMar>
+          </w:tcPr>
+          <w:p>
+            <w:r>
+              <w:rPr>
+                <w:rFonts w:ascii="Arial" w:hAnsi="Arial" w:cs="Arial"/>
+                <w:color w:val="000000"/>
+                <w:sz w:val="20"/>
+              </w:rPr>
+            </w:r>
+            <w:r>
+              <w:rPr>
+                <w:rFonts w:ascii="Arial" w:hAnsi="Arial" w:cs="Arial"/>
+                <w:color w:val="000000"/>
+                <w:sz w:val="20"/>
+              </w:rPr>
               <w:t>C01 — Visual Editing Project Analysis</w:t>
             </w:r>
           </w:p>
@@ -154,10 +300,27 @@
         <w:tc>
           <w:tcPr>
             <w:tcW w:type="dxa" w:w="1805"/>
-          </w:tcPr>
-          <w:p>
-            <w:r/>
-            <w:r>
+            <w:tcMar>
+              <w:top w:w="57" w:type="dxa"/>
+              <w:left w:w="57" w:type="dxa"/>
+              <w:bottom w:w="57" w:type="dxa"/>
+              <w:right w:w="57" w:type="dxa"/>
+            </w:tcMar>
+          </w:tcPr>
+          <w:p>
+            <w:r>
+              <w:rPr>
+                <w:rFonts w:ascii="Arial" w:hAnsi="Arial" w:cs="Arial"/>
+                <w:color w:val="000000"/>
+                <w:sz w:val="20"/>
+              </w:rPr>
+            </w:r>
+            <w:r>
+              <w:rPr>
+                <w:rFonts w:ascii="Arial" w:hAnsi="Arial" w:cs="Arial"/>
+                <w:color w:val="000000"/>
+                <w:sz w:val="20"/>
+              </w:rPr>
               <w:t>5</w:t>
             </w:r>
           </w:p>
@@ -165,32 +328,66 @@
         <w:tc>
           <w:tcPr>
             <w:tcW w:type="dxa" w:w="1805"/>
-          </w:tcPr>
-          <w:p>
-            <w:r/>
-            <w:r/>
+            <w:tcMar>
+              <w:top w:w="57" w:type="dxa"/>
+              <w:left w:w="57" w:type="dxa"/>
+              <w:bottom w:w="57" w:type="dxa"/>
+              <w:right w:w="57" w:type="dxa"/>
+            </w:tcMar>
+          </w:tcPr>
+          <w:p>
+            <w:r>
+              <w:rPr>
+                <w:rFonts w:ascii="Arial" w:hAnsi="Arial" w:cs="Arial"/>
+                <w:color w:val="000000"/>
+                <w:sz w:val="20"/>
+              </w:rPr>
+            </w:r>
+            <w:r>
+              <w:rPr>
+                <w:rFonts w:ascii="Arial" w:hAnsi="Arial" w:cs="Arial"/>
+                <w:color w:val="000000"/>
+                <w:sz w:val="20"/>
+              </w:rPr>
+            </w:r>
           </w:p>
         </w:tc>
       </w:tr>
     </w:tbl>
     <w:p/>
     <w:p>
+      <w:pPr>
+        <w:spacing w:before="120" w:after="120" w:line="276" w:lineRule="auto"/>
+        <w:jc w:val="left"/>
+      </w:pPr>
       <w:r>
         <w:rPr>
+          <w:rFonts w:ascii="Arial" w:hAnsi="Arial" w:cs="Arial"/>
           <w:b/>
-          <w:sz w:val="24"/>
+          <w:color w:val="000000"/>
+          <w:sz w:val="22"/>
         </w:rPr>
         <w:t>Aktiviti Kerja 1: Analyse visual editing project script  (IT-072-3:2012-C01-W01)</w:t>
       </w:r>
     </w:p>
     <w:p>
+      <w:pPr>
+        <w:spacing w:line="276" w:lineRule="auto" w:after="120"/>
+        <w:jc w:val="left"/>
+      </w:pPr>
       <w:r>
+        <w:rPr>
+          <w:rFonts w:ascii="Arial" w:hAnsi="Arial" w:cs="Arial"/>
+          <w:color w:val="000000"/>
+          <w:sz w:val="22"/>
+        </w:rPr>
         <w:t>Rangka topik (Bab dan sub-topik):</w:t>
       </w:r>
     </w:p>
     <w:tbl>
       <w:tblPr>
         <w:tblW w:type="auto" w:w="0"/>
+        <w:tblLayout w:type="autofit"/>
         <w:tblLook w:firstColumn="1" w:firstRow="1" w:lastColumn="0" w:lastRow="0" w:noHBand="0" w:noVBand="1" w:val="04A0"/>
       </w:tblPr>
       <w:tblGrid>
@@ -198,14 +395,28 @@
         <w:gridCol w:w="4513"/>
       </w:tblGrid>
       <w:tr>
-        <w:tc>
-          <w:tcPr>
-            <w:tcW w:type="dxa" w:w="4513"/>
-          </w:tcPr>
-          <w:p>
-            <w:r>
-              <w:rPr>
+        <w:trPr>
+          <w:tblHeader w:val="true"/>
+          <w:cantSplit w:val="true"/>
+        </w:trPr>
+        <w:tc>
+          <w:tcPr>
+            <w:tcW w:type="dxa" w:w="4513"/>
+            <w:tcMar>
+              <w:top w:w="57" w:type="dxa"/>
+              <w:left w:w="57" w:type="dxa"/>
+              <w:bottom w:w="57" w:type="dxa"/>
+              <w:right w:w="57" w:type="dxa"/>
+            </w:tcMar>
+            <w:shd w:val="clear" w:color="auto" w:fill="D9D9D9"/>
+          </w:tcPr>
+          <w:p>
+            <w:r>
+              <w:rPr>
+                <w:rFonts w:ascii="Arial" w:hAnsi="Arial" w:cs="Arial"/>
                 <w:b/>
+                <w:color w:val="000000"/>
+                <w:sz w:val="20"/>
               </w:rPr>
               <w:t>Bab</w:t>
             </w:r>
@@ -214,11 +425,21 @@
         <w:tc>
           <w:tcPr>
             <w:tcW w:type="dxa" w:w="4513"/>
-          </w:tcPr>
-          <w:p>
-            <w:r>
-              <w:rPr>
+            <w:tcMar>
+              <w:top w:w="57" w:type="dxa"/>
+              <w:left w:w="57" w:type="dxa"/>
+              <w:bottom w:w="57" w:type="dxa"/>
+              <w:right w:w="57" w:type="dxa"/>
+            </w:tcMar>
+            <w:shd w:val="clear" w:color="auto" w:fill="D9D9D9"/>
+          </w:tcPr>
+          <w:p>
+            <w:r>
+              <w:rPr>
+                <w:rFonts w:ascii="Arial" w:hAnsi="Arial" w:cs="Arial"/>
                 <w:b/>
+                <w:color w:val="000000"/>
+                <w:sz w:val="20"/>
               </w:rPr>
               <w:t>Sub-topik</w:t>
             </w:r>
@@ -226,12 +447,26 @@
         </w:tc>
       </w:tr>
       <w:tr>
-        <w:tc>
-          <w:tcPr>
-            <w:tcW w:type="dxa" w:w="4513"/>
-          </w:tcPr>
-          <w:p>
-            <w:r>
+        <w:trPr>
+          <w:cantSplit w:val="true"/>
+        </w:trPr>
+        <w:tc>
+          <w:tcPr>
+            <w:tcW w:type="dxa" w:w="4513"/>
+            <w:tcMar>
+              <w:top w:w="57" w:type="dxa"/>
+              <w:left w:w="57" w:type="dxa"/>
+              <w:bottom w:w="57" w:type="dxa"/>
+              <w:right w:w="57" w:type="dxa"/>
+            </w:tcMar>
+          </w:tcPr>
+          <w:p>
+            <w:r>
+              <w:rPr>
+                <w:rFonts w:ascii="Arial" w:hAnsi="Arial" w:cs="Arial"/>
+                <w:color w:val="000000"/>
+                <w:sz w:val="20"/>
+              </w:rPr>
               <w:t>Bab 1: Types of Script</w:t>
             </w:r>
           </w:p>
@@ -239,9 +474,20 @@
         <w:tc>
           <w:tcPr>
             <w:tcW w:type="dxa" w:w="4513"/>
-          </w:tcPr>
-          <w:p>
-            <w:r>
+            <w:tcMar>
+              <w:top w:w="57" w:type="dxa"/>
+              <w:left w:w="57" w:type="dxa"/>
+              <w:bottom w:w="57" w:type="dxa"/>
+              <w:right w:w="57" w:type="dxa"/>
+            </w:tcMar>
+          </w:tcPr>
+          <w:p>
+            <w:r>
+              <w:rPr>
+                <w:rFonts w:ascii="Arial" w:hAnsi="Arial" w:cs="Arial"/>
+                <w:color w:val="000000"/>
+                <w:sz w:val="20"/>
+              </w:rPr>
               <w:t>1. Definisi dan Kepentingan Skrip</w:t>
               <w:br/>
               <w:t>2. Jenis-jenis Skrip dalam Industri</w:t>
@@ -252,12 +498,26 @@
         </w:tc>
       </w:tr>
       <w:tr>
-        <w:tc>
-          <w:tcPr>
-            <w:tcW w:type="dxa" w:w="4513"/>
-          </w:tcPr>
-          <w:p>
-            <w:r>
+        <w:trPr>
+          <w:cantSplit w:val="true"/>
+        </w:trPr>
+        <w:tc>
+          <w:tcPr>
+            <w:tcW w:type="dxa" w:w="4513"/>
+            <w:tcMar>
+              <w:top w:w="57" w:type="dxa"/>
+              <w:left w:w="57" w:type="dxa"/>
+              <w:bottom w:w="57" w:type="dxa"/>
+              <w:right w:w="57" w:type="dxa"/>
+            </w:tcMar>
+          </w:tcPr>
+          <w:p>
+            <w:r>
+              <w:rPr>
+                <w:rFonts w:ascii="Arial" w:hAnsi="Arial" w:cs="Arial"/>
+                <w:color w:val="000000"/>
+                <w:sz w:val="20"/>
+              </w:rPr>
               <w:t>Bab 2: Project Concept — Storyline, Message, Theme, Genre</w:t>
             </w:r>
           </w:p>
@@ -265,9 +525,20 @@
         <w:tc>
           <w:tcPr>
             <w:tcW w:type="dxa" w:w="4513"/>
-          </w:tcPr>
-          <w:p>
-            <w:r>
+            <w:tcMar>
+              <w:top w:w="57" w:type="dxa"/>
+              <w:left w:w="57" w:type="dxa"/>
+              <w:bottom w:w="57" w:type="dxa"/>
+              <w:right w:w="57" w:type="dxa"/>
+            </w:tcMar>
+          </w:tcPr>
+          <w:p>
+            <w:r>
+              <w:rPr>
+                <w:rFonts w:ascii="Arial" w:hAnsi="Arial" w:cs="Arial"/>
+                <w:color w:val="000000"/>
+                <w:sz w:val="20"/>
+              </w:rPr>
               <w:t>1. Storyline dan Message</w:t>
               <w:br/>
               <w:t>2. Theme dan Genre</w:t>
@@ -278,12 +549,26 @@
         </w:tc>
       </w:tr>
       <w:tr>
-        <w:tc>
-          <w:tcPr>
-            <w:tcW w:type="dxa" w:w="4513"/>
-          </w:tcPr>
-          <w:p>
-            <w:r>
+        <w:trPr>
+          <w:cantSplit w:val="true"/>
+        </w:trPr>
+        <w:tc>
+          <w:tcPr>
+            <w:tcW w:type="dxa" w:w="4513"/>
+            <w:tcMar>
+              <w:top w:w="57" w:type="dxa"/>
+              <w:left w:w="57" w:type="dxa"/>
+              <w:bottom w:w="57" w:type="dxa"/>
+              <w:right w:w="57" w:type="dxa"/>
+            </w:tcMar>
+          </w:tcPr>
+          <w:p>
+            <w:r>
+              <w:rPr>
+                <w:rFonts w:ascii="Arial" w:hAnsi="Arial" w:cs="Arial"/>
+                <w:color w:val="000000"/>
+                <w:sz w:val="20"/>
+              </w:rPr>
               <w:t>Bab 3: Type of Audio — Dialogue, Voice Over, Music, Ambience</w:t>
             </w:r>
           </w:p>
@@ -291,9 +576,20 @@
         <w:tc>
           <w:tcPr>
             <w:tcW w:type="dxa" w:w="4513"/>
-          </w:tcPr>
-          <w:p>
-            <w:r>
+            <w:tcMar>
+              <w:top w:w="57" w:type="dxa"/>
+              <w:left w:w="57" w:type="dxa"/>
+              <w:bottom w:w="57" w:type="dxa"/>
+              <w:right w:w="57" w:type="dxa"/>
+            </w:tcMar>
+          </w:tcPr>
+          <w:p>
+            <w:r>
+              <w:rPr>
+                <w:rFonts w:ascii="Arial" w:hAnsi="Arial" w:cs="Arial"/>
+                <w:color w:val="000000"/>
+                <w:sz w:val="20"/>
+              </w:rPr>
               <w:t>1. Klasifikasi Jenis Audio</w:t>
               <w:br/>
               <w:t>2. Kaitan dengan Perancangan Projek</w:t>
@@ -302,12 +598,26 @@
         </w:tc>
       </w:tr>
       <w:tr>
-        <w:tc>
-          <w:tcPr>
-            <w:tcW w:type="dxa" w:w="4513"/>
-          </w:tcPr>
-          <w:p>
-            <w:r>
+        <w:trPr>
+          <w:cantSplit w:val="true"/>
+        </w:trPr>
+        <w:tc>
+          <w:tcPr>
+            <w:tcW w:type="dxa" w:w="4513"/>
+            <w:tcMar>
+              <w:top w:w="57" w:type="dxa"/>
+              <w:left w:w="57" w:type="dxa"/>
+              <w:bottom w:w="57" w:type="dxa"/>
+              <w:right w:w="57" w:type="dxa"/>
+            </w:tcMar>
+          </w:tcPr>
+          <w:p>
+            <w:r>
+              <w:rPr>
+                <w:rFonts w:ascii="Arial" w:hAnsi="Arial" w:cs="Arial"/>
+                <w:color w:val="000000"/>
+                <w:sz w:val="20"/>
+              </w:rPr>
               <w:t>Bab 4: Type of Language Version — Single, Bi-language, Multi Language</w:t>
             </w:r>
           </w:p>
@@ -315,9 +625,20 @@
         <w:tc>
           <w:tcPr>
             <w:tcW w:type="dxa" w:w="4513"/>
-          </w:tcPr>
-          <w:p>
-            <w:r>
+            <w:tcMar>
+              <w:top w:w="57" w:type="dxa"/>
+              <w:left w:w="57" w:type="dxa"/>
+              <w:bottom w:w="57" w:type="dxa"/>
+              <w:right w:w="57" w:type="dxa"/>
+            </w:tcMar>
+          </w:tcPr>
+          <w:p>
+            <w:r>
+              <w:rPr>
+                <w:rFonts w:ascii="Arial" w:hAnsi="Arial" w:cs="Arial"/>
+                <w:color w:val="000000"/>
+                <w:sz w:val="20"/>
+              </w:rPr>
               <w:t>1. Jenis-jenis Versi Bahasa</w:t>
               <w:br/>
               <w:t>2. Implikasi terhadap Struktur Timeline</w:t>
@@ -326,12 +647,26 @@
         </w:tc>
       </w:tr>
       <w:tr>
-        <w:tc>
-          <w:tcPr>
-            <w:tcW w:type="dxa" w:w="4513"/>
-          </w:tcPr>
-          <w:p>
-            <w:r>
+        <w:trPr>
+          <w:cantSplit w:val="true"/>
+        </w:trPr>
+        <w:tc>
+          <w:tcPr>
+            <w:tcW w:type="dxa" w:w="4513"/>
+            <w:tcMar>
+              <w:top w:w="57" w:type="dxa"/>
+              <w:left w:w="57" w:type="dxa"/>
+              <w:bottom w:w="57" w:type="dxa"/>
+              <w:right w:w="57" w:type="dxa"/>
+            </w:tcMar>
+          </w:tcPr>
+          <w:p>
+            <w:r>
+              <w:rPr>
+                <w:rFonts w:ascii="Arial" w:hAnsi="Arial" w:cs="Arial"/>
+                <w:color w:val="000000"/>
+                <w:sz w:val="20"/>
+              </w:rPr>
               <w:t>Bab 5: Project Media Output — Web, Tape, Film, Hardisk, DVD/Blu-ray, 3D Stereoscopic</w:t>
             </w:r>
           </w:p>
@@ -339,9 +674,20 @@
         <w:tc>
           <w:tcPr>
             <w:tcW w:type="dxa" w:w="4513"/>
-          </w:tcPr>
-          <w:p>
-            <w:r>
+            <w:tcMar>
+              <w:top w:w="57" w:type="dxa"/>
+              <w:left w:w="57" w:type="dxa"/>
+              <w:bottom w:w="57" w:type="dxa"/>
+              <w:right w:w="57" w:type="dxa"/>
+            </w:tcMar>
+          </w:tcPr>
+          <w:p>
+            <w:r>
+              <w:rPr>
+                <w:rFonts w:ascii="Arial" w:hAnsi="Arial" w:cs="Arial"/>
+                <w:color w:val="000000"/>
+                <w:sz w:val="20"/>
+              </w:rPr>
               <w:t>1. Jenis-jenis Output Media</w:t>
               <w:br/>
               <w:t>2. Kaitan dengan Sequence Settings</w:t>
@@ -350,12 +696,26 @@
         </w:tc>
       </w:tr>
       <w:tr>
-        <w:tc>
-          <w:tcPr>
-            <w:tcW w:type="dxa" w:w="4513"/>
-          </w:tcPr>
-          <w:p>
-            <w:r>
+        <w:trPr>
+          <w:cantSplit w:val="true"/>
+        </w:trPr>
+        <w:tc>
+          <w:tcPr>
+            <w:tcW w:type="dxa" w:w="4513"/>
+            <w:tcMar>
+              <w:top w:w="57" w:type="dxa"/>
+              <w:left w:w="57" w:type="dxa"/>
+              <w:bottom w:w="57" w:type="dxa"/>
+              <w:right w:w="57" w:type="dxa"/>
+            </w:tcMar>
+          </w:tcPr>
+          <w:p>
+            <w:r>
+              <w:rPr>
+                <w:rFonts w:ascii="Arial" w:hAnsi="Arial" w:cs="Arial"/>
+                <w:color w:val="000000"/>
+                <w:sz w:val="20"/>
+              </w:rPr>
               <w:t>Bab 6: Project Duration — Script Requirement, Man Hour Requirement, Machine Availability</w:t>
             </w:r>
           </w:p>
@@ -363,9 +723,20 @@
         <w:tc>
           <w:tcPr>
             <w:tcW w:type="dxa" w:w="4513"/>
-          </w:tcPr>
-          <w:p>
-            <w:r>
+            <w:tcMar>
+              <w:top w:w="57" w:type="dxa"/>
+              <w:left w:w="57" w:type="dxa"/>
+              <w:bottom w:w="57" w:type="dxa"/>
+              <w:right w:w="57" w:type="dxa"/>
+            </w:tcMar>
+          </w:tcPr>
+          <w:p>
+            <w:r>
+              <w:rPr>
+                <w:rFonts w:ascii="Arial" w:hAnsi="Arial" w:cs="Arial"/>
+                <w:color w:val="000000"/>
+                <w:sz w:val="20"/>
+              </w:rPr>
               <w:t>1. Script Requirement</w:t>
               <w:br/>
               <w:t>2. Man Hour Requirement</w:t>
@@ -376,12 +747,26 @@
         </w:tc>
       </w:tr>
       <w:tr>
-        <w:tc>
-          <w:tcPr>
-            <w:tcW w:type="dxa" w:w="4513"/>
-          </w:tcPr>
-          <w:p>
-            <w:r>
+        <w:trPr>
+          <w:cantSplit w:val="true"/>
+        </w:trPr>
+        <w:tc>
+          <w:tcPr>
+            <w:tcW w:type="dxa" w:w="4513"/>
+            <w:tcMar>
+              <w:top w:w="57" w:type="dxa"/>
+              <w:left w:w="57" w:type="dxa"/>
+              <w:bottom w:w="57" w:type="dxa"/>
+              <w:right w:w="57" w:type="dxa"/>
+            </w:tcMar>
+          </w:tcPr>
+          <w:p>
+            <w:r>
+              <w:rPr>
+                <w:rFonts w:ascii="Arial" w:hAnsi="Arial" w:cs="Arial"/>
+                <w:color w:val="000000"/>
+                <w:sz w:val="20"/>
+              </w:rPr>
               <w:t>Bab 7: Editing Technique in Theory</w:t>
             </w:r>
           </w:p>
@@ -389,9 +774,20 @@
         <w:tc>
           <w:tcPr>
             <w:tcW w:type="dxa" w:w="4513"/>
-          </w:tcPr>
-          <w:p>
-            <w:r>
+            <w:tcMar>
+              <w:top w:w="57" w:type="dxa"/>
+              <w:left w:w="57" w:type="dxa"/>
+              <w:bottom w:w="57" w:type="dxa"/>
+              <w:right w:w="57" w:type="dxa"/>
+            </w:tcMar>
+          </w:tcPr>
+          <w:p>
+            <w:r>
+              <w:rPr>
+                <w:rFonts w:ascii="Arial" w:hAnsi="Arial" w:cs="Arial"/>
+                <w:color w:val="000000"/>
+                <w:sz w:val="20"/>
+              </w:rPr>
               <w:t>1. Senarai Teknik Editing</w:t>
               <w:br/>
               <w:t>2. Kegunaan pada Peringkat Analisis</w:t>
@@ -402,22 +798,38 @@
     </w:tbl>
     <w:p/>
     <w:p>
+      <w:pPr>
+        <w:spacing w:before="120" w:after="120" w:line="276" w:lineRule="auto"/>
+        <w:jc w:val="left"/>
+      </w:pPr>
       <w:r>
         <w:rPr>
+          <w:rFonts w:ascii="Arial" w:hAnsi="Arial" w:cs="Arial"/>
           <w:b/>
-          <w:sz w:val="24"/>
+          <w:color w:val="000000"/>
+          <w:sz w:val="22"/>
         </w:rPr>
         <w:t>Aktiviti Kerja 2: Analyse visual editing project concept  (IT-072-3:2012-C01-W02)</w:t>
       </w:r>
     </w:p>
     <w:p>
+      <w:pPr>
+        <w:spacing w:line="276" w:lineRule="auto" w:after="120"/>
+        <w:jc w:val="left"/>
+      </w:pPr>
       <w:r>
+        <w:rPr>
+          <w:rFonts w:ascii="Arial" w:hAnsi="Arial" w:cs="Arial"/>
+          <w:color w:val="000000"/>
+          <w:sz w:val="22"/>
+        </w:rPr>
         <w:t>Rangka topik (Bab dan sub-topik):</w:t>
       </w:r>
     </w:p>
     <w:tbl>
       <w:tblPr>
         <w:tblW w:type="auto" w:w="0"/>
+        <w:tblLayout w:type="autofit"/>
         <w:tblLook w:firstColumn="1" w:firstRow="1" w:lastColumn="0" w:lastRow="0" w:noHBand="0" w:noVBand="1" w:val="04A0"/>
       </w:tblPr>
       <w:tblGrid>
@@ -425,14 +837,28 @@
         <w:gridCol w:w="4513"/>
       </w:tblGrid>
       <w:tr>
-        <w:tc>
-          <w:tcPr>
-            <w:tcW w:type="dxa" w:w="4513"/>
-          </w:tcPr>
-          <w:p>
-            <w:r>
-              <w:rPr>
+        <w:trPr>
+          <w:tblHeader w:val="true"/>
+          <w:cantSplit w:val="true"/>
+        </w:trPr>
+        <w:tc>
+          <w:tcPr>
+            <w:tcW w:type="dxa" w:w="4513"/>
+            <w:tcMar>
+              <w:top w:w="57" w:type="dxa"/>
+              <w:left w:w="57" w:type="dxa"/>
+              <w:bottom w:w="57" w:type="dxa"/>
+              <w:right w:w="57" w:type="dxa"/>
+            </w:tcMar>
+            <w:shd w:val="clear" w:color="auto" w:fill="D9D9D9"/>
+          </w:tcPr>
+          <w:p>
+            <w:r>
+              <w:rPr>
+                <w:rFonts w:ascii="Arial" w:hAnsi="Arial" w:cs="Arial"/>
                 <w:b/>
+                <w:color w:val="000000"/>
+                <w:sz w:val="20"/>
               </w:rPr>
               <w:t>Bab</w:t>
             </w:r>
@@ -441,11 +867,21 @@
         <w:tc>
           <w:tcPr>
             <w:tcW w:type="dxa" w:w="4513"/>
-          </w:tcPr>
-          <w:p>
-            <w:r>
-              <w:rPr>
+            <w:tcMar>
+              <w:top w:w="57" w:type="dxa"/>
+              <w:left w:w="57" w:type="dxa"/>
+              <w:bottom w:w="57" w:type="dxa"/>
+              <w:right w:w="57" w:type="dxa"/>
+            </w:tcMar>
+            <w:shd w:val="clear" w:color="auto" w:fill="D9D9D9"/>
+          </w:tcPr>
+          <w:p>
+            <w:r>
+              <w:rPr>
+                <w:rFonts w:ascii="Arial" w:hAnsi="Arial" w:cs="Arial"/>
                 <w:b/>
+                <w:color w:val="000000"/>
+                <w:sz w:val="20"/>
               </w:rPr>
               <w:t>Sub-topik</w:t>
             </w:r>
@@ -453,12 +889,26 @@
         </w:tc>
       </w:tr>
       <w:tr>
-        <w:tc>
-          <w:tcPr>
-            <w:tcW w:type="dxa" w:w="4513"/>
-          </w:tcPr>
-          <w:p>
-            <w:r>
+        <w:trPr>
+          <w:cantSplit w:val="true"/>
+        </w:trPr>
+        <w:tc>
+          <w:tcPr>
+            <w:tcW w:type="dxa" w:w="4513"/>
+            <w:tcMar>
+              <w:top w:w="57" w:type="dxa"/>
+              <w:left w:w="57" w:type="dxa"/>
+              <w:bottom w:w="57" w:type="dxa"/>
+              <w:right w:w="57" w:type="dxa"/>
+            </w:tcMar>
+          </w:tcPr>
+          <w:p>
+            <w:r>
+              <w:rPr>
+                <w:rFonts w:ascii="Arial" w:hAnsi="Arial" w:cs="Arial"/>
+                <w:color w:val="000000"/>
+                <w:sz w:val="20"/>
+              </w:rPr>
               <w:t>Bab 1: Category of Genre</w:t>
             </w:r>
           </w:p>
@@ -466,9 +916,20 @@
         <w:tc>
           <w:tcPr>
             <w:tcW w:type="dxa" w:w="4513"/>
-          </w:tcPr>
-          <w:p>
-            <w:r>
+            <w:tcMar>
+              <w:top w:w="57" w:type="dxa"/>
+              <w:left w:w="57" w:type="dxa"/>
+              <w:bottom w:w="57" w:type="dxa"/>
+              <w:right w:w="57" w:type="dxa"/>
+            </w:tcMar>
+          </w:tcPr>
+          <w:p>
+            <w:r>
+              <w:rPr>
+                <w:rFonts w:ascii="Arial" w:hAnsi="Arial" w:cs="Arial"/>
+                <w:color w:val="000000"/>
+                <w:sz w:val="20"/>
+              </w:rPr>
               <w:t>1. Senarai Kategori Genre</w:t>
               <w:br/>
               <w:t>2. Konvensyen Editing Mengikut Genre</w:t>
@@ -477,12 +938,26 @@
         </w:tc>
       </w:tr>
       <w:tr>
-        <w:tc>
-          <w:tcPr>
-            <w:tcW w:type="dxa" w:w="4513"/>
-          </w:tcPr>
-          <w:p>
-            <w:r>
+        <w:trPr>
+          <w:cantSplit w:val="true"/>
+        </w:trPr>
+        <w:tc>
+          <w:tcPr>
+            <w:tcW w:type="dxa" w:w="4513"/>
+            <w:tcMar>
+              <w:top w:w="57" w:type="dxa"/>
+              <w:left w:w="57" w:type="dxa"/>
+              <w:bottom w:w="57" w:type="dxa"/>
+              <w:right w:w="57" w:type="dxa"/>
+            </w:tcMar>
+          </w:tcPr>
+          <w:p>
+            <w:r>
+              <w:rPr>
+                <w:rFonts w:ascii="Arial" w:hAnsi="Arial" w:cs="Arial"/>
+                <w:color w:val="000000"/>
+                <w:sz w:val="20"/>
+              </w:rPr>
               <w:t>Bab 2: Types of Genre</w:t>
             </w:r>
           </w:p>
@@ -490,9 +965,20 @@
         <w:tc>
           <w:tcPr>
             <w:tcW w:type="dxa" w:w="4513"/>
-          </w:tcPr>
-          <w:p>
-            <w:r>
+            <w:tcMar>
+              <w:top w:w="57" w:type="dxa"/>
+              <w:left w:w="57" w:type="dxa"/>
+              <w:bottom w:w="57" w:type="dxa"/>
+              <w:right w:w="57" w:type="dxa"/>
+            </w:tcMar>
+          </w:tcPr>
+          <w:p>
+            <w:r>
+              <w:rPr>
+                <w:rFonts w:ascii="Arial" w:hAnsi="Arial" w:cs="Arial"/>
+                <w:color w:val="000000"/>
+                <w:sz w:val="20"/>
+              </w:rPr>
               <w:t>1. Pecahan Sub-genre (verbatim CoCU)</w:t>
               <w:br/>
               <w:t>2. Contoh Amalan</w:t>
@@ -501,12 +987,26 @@
         </w:tc>
       </w:tr>
       <w:tr>
-        <w:tc>
-          <w:tcPr>
-            <w:tcW w:type="dxa" w:w="4513"/>
-          </w:tcPr>
-          <w:p>
-            <w:r>
+        <w:trPr>
+          <w:cantSplit w:val="true"/>
+        </w:trPr>
+        <w:tc>
+          <w:tcPr>
+            <w:tcW w:type="dxa" w:w="4513"/>
+            <w:tcMar>
+              <w:top w:w="57" w:type="dxa"/>
+              <w:left w:w="57" w:type="dxa"/>
+              <w:bottom w:w="57" w:type="dxa"/>
+              <w:right w:w="57" w:type="dxa"/>
+            </w:tcMar>
+          </w:tcPr>
+          <w:p>
+            <w:r>
+              <w:rPr>
+                <w:rFonts w:ascii="Arial" w:hAnsi="Arial" w:cs="Arial"/>
+                <w:color w:val="000000"/>
+                <w:sz w:val="20"/>
+              </w:rPr>
               <w:t>Bab 3: Category of Theme</w:t>
             </w:r>
           </w:p>
@@ -514,9 +1014,20 @@
         <w:tc>
           <w:tcPr>
             <w:tcW w:type="dxa" w:w="4513"/>
-          </w:tcPr>
-          <w:p>
-            <w:r>
+            <w:tcMar>
+              <w:top w:w="57" w:type="dxa"/>
+              <w:left w:w="57" w:type="dxa"/>
+              <w:bottom w:w="57" w:type="dxa"/>
+              <w:right w:w="57" w:type="dxa"/>
+            </w:tcMar>
+          </w:tcPr>
+          <w:p>
+            <w:r>
+              <w:rPr>
+                <w:rFonts w:ascii="Arial" w:hAnsi="Arial" w:cs="Arial"/>
+                <w:color w:val="000000"/>
+                <w:sz w:val="20"/>
+              </w:rPr>
               <w:t>1. Definisi Tema</w:t>
               <w:br/>
               <w:t>2. Tiga Kategori Tema (verbatim CoCU)</w:t>
@@ -527,12 +1038,26 @@
         </w:tc>
       </w:tr>
       <w:tr>
-        <w:tc>
-          <w:tcPr>
-            <w:tcW w:type="dxa" w:w="4513"/>
-          </w:tcPr>
-          <w:p>
-            <w:r>
+        <w:trPr>
+          <w:cantSplit w:val="true"/>
+        </w:trPr>
+        <w:tc>
+          <w:tcPr>
+            <w:tcW w:type="dxa" w:w="4513"/>
+            <w:tcMar>
+              <w:top w:w="57" w:type="dxa"/>
+              <w:left w:w="57" w:type="dxa"/>
+              <w:bottom w:w="57" w:type="dxa"/>
+              <w:right w:w="57" w:type="dxa"/>
+            </w:tcMar>
+          </w:tcPr>
+          <w:p>
+            <w:r>
+              <w:rPr>
+                <w:rFonts w:ascii="Arial" w:hAnsi="Arial" w:cs="Arial"/>
+                <w:color w:val="000000"/>
+                <w:sz w:val="20"/>
+              </w:rPr>
               <w:t>Bab 4: Visual Effect (VFX) Elements</w:t>
             </w:r>
           </w:p>
@@ -540,9 +1065,20 @@
         <w:tc>
           <w:tcPr>
             <w:tcW w:type="dxa" w:w="4513"/>
-          </w:tcPr>
-          <w:p>
-            <w:r>
+            <w:tcMar>
+              <w:top w:w="57" w:type="dxa"/>
+              <w:left w:w="57" w:type="dxa"/>
+              <w:bottom w:w="57" w:type="dxa"/>
+              <w:right w:w="57" w:type="dxa"/>
+            </w:tcMar>
+          </w:tcPr>
+          <w:p>
+            <w:r>
+              <w:rPr>
+                <w:rFonts w:ascii="Arial" w:hAnsi="Arial" w:cs="Arial"/>
+                <w:color w:val="000000"/>
+                <w:sz w:val="20"/>
+              </w:rPr>
               <w:t>1. Empat Elemen VFX (verbatim CoCU)</w:t>
               <w:br/>
               <w:t>2. Peranan Editor</w:t>
@@ -551,12 +1087,26 @@
         </w:tc>
       </w:tr>
       <w:tr>
-        <w:tc>
-          <w:tcPr>
-            <w:tcW w:type="dxa" w:w="4513"/>
-          </w:tcPr>
-          <w:p>
-            <w:r>
+        <w:trPr>
+          <w:cantSplit w:val="true"/>
+        </w:trPr>
+        <w:tc>
+          <w:tcPr>
+            <w:tcW w:type="dxa" w:w="4513"/>
+            <w:tcMar>
+              <w:top w:w="57" w:type="dxa"/>
+              <w:left w:w="57" w:type="dxa"/>
+              <w:bottom w:w="57" w:type="dxa"/>
+              <w:right w:w="57" w:type="dxa"/>
+            </w:tcMar>
+          </w:tcPr>
+          <w:p>
+            <w:r>
+              <w:rPr>
+                <w:rFonts w:ascii="Arial" w:hAnsi="Arial" w:cs="Arial"/>
+                <w:color w:val="000000"/>
+                <w:sz w:val="20"/>
+              </w:rPr>
               <w:t>Bab 5: Sound Effect</w:t>
             </w:r>
           </w:p>
@@ -564,9 +1114,20 @@
         <w:tc>
           <w:tcPr>
             <w:tcW w:type="dxa" w:w="4513"/>
-          </w:tcPr>
-          <w:p>
-            <w:r>
+            <w:tcMar>
+              <w:top w:w="57" w:type="dxa"/>
+              <w:left w:w="57" w:type="dxa"/>
+              <w:bottom w:w="57" w:type="dxa"/>
+              <w:right w:w="57" w:type="dxa"/>
+            </w:tcMar>
+          </w:tcPr>
+          <w:p>
+            <w:r>
+              <w:rPr>
+                <w:rFonts w:ascii="Arial" w:hAnsi="Arial" w:cs="Arial"/>
+                <w:color w:val="000000"/>
+                <w:sz w:val="20"/>
+              </w:rPr>
               <w:t>1. Kategori Sound Effect (verbatim CoCU)</w:t>
               <w:br/>
               <w:t>2. Kaitan dengan Perancangan Audio</w:t>
@@ -575,12 +1136,26 @@
         </w:tc>
       </w:tr>
       <w:tr>
-        <w:tc>
-          <w:tcPr>
-            <w:tcW w:type="dxa" w:w="4513"/>
-          </w:tcPr>
-          <w:p>
-            <w:r>
+        <w:trPr>
+          <w:cantSplit w:val="true"/>
+        </w:trPr>
+        <w:tc>
+          <w:tcPr>
+            <w:tcW w:type="dxa" w:w="4513"/>
+            <w:tcMar>
+              <w:top w:w="57" w:type="dxa"/>
+              <w:left w:w="57" w:type="dxa"/>
+              <w:bottom w:w="57" w:type="dxa"/>
+              <w:right w:w="57" w:type="dxa"/>
+            </w:tcMar>
+          </w:tcPr>
+          <w:p>
+            <w:r>
+              <w:rPr>
+                <w:rFonts w:ascii="Arial" w:hAnsi="Arial" w:cs="Arial"/>
+                <w:color w:val="000000"/>
+                <w:sz w:val="20"/>
+              </w:rPr>
               <w:t>Bab 6: Background Music</w:t>
             </w:r>
           </w:p>
@@ -588,9 +1163,20 @@
         <w:tc>
           <w:tcPr>
             <w:tcW w:type="dxa" w:w="4513"/>
-          </w:tcPr>
-          <w:p>
-            <w:r>
+            <w:tcMar>
+              <w:top w:w="57" w:type="dxa"/>
+              <w:left w:w="57" w:type="dxa"/>
+              <w:bottom w:w="57" w:type="dxa"/>
+              <w:right w:w="57" w:type="dxa"/>
+            </w:tcMar>
+          </w:tcPr>
+          <w:p>
+            <w:r>
+              <w:rPr>
+                <w:rFonts w:ascii="Arial" w:hAnsi="Arial" w:cs="Arial"/>
+                <w:color w:val="000000"/>
+                <w:sz w:val="20"/>
+              </w:rPr>
               <w:t>1. Enam Jenis Background Music (verbatim CoCU)</w:t>
               <w:br/>
               <w:t>2. Kesan terhadap Rentak Editing</w:t>
@@ -599,12 +1185,26 @@
         </w:tc>
       </w:tr>
       <w:tr>
-        <w:tc>
-          <w:tcPr>
-            <w:tcW w:type="dxa" w:w="4513"/>
-          </w:tcPr>
-          <w:p>
-            <w:r>
+        <w:trPr>
+          <w:cantSplit w:val="true"/>
+        </w:trPr>
+        <w:tc>
+          <w:tcPr>
+            <w:tcW w:type="dxa" w:w="4513"/>
+            <w:tcMar>
+              <w:top w:w="57" w:type="dxa"/>
+              <w:left w:w="57" w:type="dxa"/>
+              <w:bottom w:w="57" w:type="dxa"/>
+              <w:right w:w="57" w:type="dxa"/>
+            </w:tcMar>
+          </w:tcPr>
+          <w:p>
+            <w:r>
+              <w:rPr>
+                <w:rFonts w:ascii="Arial" w:hAnsi="Arial" w:cs="Arial"/>
+                <w:color w:val="000000"/>
+                <w:sz w:val="20"/>
+              </w:rPr>
               <w:t>Bab 7: Editing Technique (Konteks Kreatif)</w:t>
             </w:r>
           </w:p>
@@ -612,9 +1212,20 @@
         <w:tc>
           <w:tcPr>
             <w:tcW w:type="dxa" w:w="4513"/>
-          </w:tcPr>
-          <w:p>
-            <w:r>
+            <w:tcMar>
+              <w:top w:w="57" w:type="dxa"/>
+              <w:left w:w="57" w:type="dxa"/>
+              <w:bottom w:w="57" w:type="dxa"/>
+              <w:right w:w="57" w:type="dxa"/>
+            </w:tcMar>
+          </w:tcPr>
+          <w:p>
+            <w:r>
+              <w:rPr>
+                <w:rFonts w:ascii="Arial" w:hAnsi="Arial" w:cs="Arial"/>
+                <w:color w:val="000000"/>
+                <w:sz w:val="20"/>
+              </w:rPr>
               <w:t>1. Teknik Editing dalam Konteks Kreatif</w:t>
               <w:br/>
               <w:t>2. Penyelarasan dengan Elemen Kreatif Lain</w:t>
@@ -625,22 +1236,38 @@
     </w:tbl>
     <w:p/>
     <w:p>
+      <w:pPr>
+        <w:spacing w:before="120" w:after="120" w:line="276" w:lineRule="auto"/>
+        <w:jc w:val="left"/>
+      </w:pPr>
       <w:r>
         <w:rPr>
+          <w:rFonts w:ascii="Arial" w:hAnsi="Arial" w:cs="Arial"/>
           <w:b/>
-          <w:sz w:val="24"/>
+          <w:color w:val="000000"/>
+          <w:sz w:val="22"/>
         </w:rPr>
         <w:t>Aktiviti Kerja 3: Classify visual editing format and source  (IT-072-3:2012-C01-W03)</w:t>
       </w:r>
     </w:p>
     <w:p>
+      <w:pPr>
+        <w:spacing w:line="276" w:lineRule="auto" w:after="120"/>
+        <w:jc w:val="left"/>
+      </w:pPr>
       <w:r>
+        <w:rPr>
+          <w:rFonts w:ascii="Arial" w:hAnsi="Arial" w:cs="Arial"/>
+          <w:color w:val="000000"/>
+          <w:sz w:val="22"/>
+        </w:rPr>
         <w:t>Rangka topik (Bab dan sub-topik):</w:t>
       </w:r>
     </w:p>
     <w:tbl>
       <w:tblPr>
         <w:tblW w:type="auto" w:w="0"/>
+        <w:tblLayout w:type="autofit"/>
         <w:tblLook w:firstColumn="1" w:firstRow="1" w:lastColumn="0" w:lastRow="0" w:noHBand="0" w:noVBand="1" w:val="04A0"/>
       </w:tblPr>
       <w:tblGrid>
@@ -648,14 +1275,28 @@
         <w:gridCol w:w="4513"/>
       </w:tblGrid>
       <w:tr>
-        <w:tc>
-          <w:tcPr>
-            <w:tcW w:type="dxa" w:w="4513"/>
-          </w:tcPr>
-          <w:p>
-            <w:r>
-              <w:rPr>
+        <w:trPr>
+          <w:tblHeader w:val="true"/>
+          <w:cantSplit w:val="true"/>
+        </w:trPr>
+        <w:tc>
+          <w:tcPr>
+            <w:tcW w:type="dxa" w:w="4513"/>
+            <w:tcMar>
+              <w:top w:w="57" w:type="dxa"/>
+              <w:left w:w="57" w:type="dxa"/>
+              <w:bottom w:w="57" w:type="dxa"/>
+              <w:right w:w="57" w:type="dxa"/>
+            </w:tcMar>
+            <w:shd w:val="clear" w:color="auto" w:fill="D9D9D9"/>
+          </w:tcPr>
+          <w:p>
+            <w:r>
+              <w:rPr>
+                <w:rFonts w:ascii="Arial" w:hAnsi="Arial" w:cs="Arial"/>
                 <w:b/>
+                <w:color w:val="000000"/>
+                <w:sz w:val="20"/>
               </w:rPr>
               <w:t>Bab</w:t>
             </w:r>
@@ -664,11 +1305,21 @@
         <w:tc>
           <w:tcPr>
             <w:tcW w:type="dxa" w:w="4513"/>
-          </w:tcPr>
-          <w:p>
-            <w:r>
-              <w:rPr>
+            <w:tcMar>
+              <w:top w:w="57" w:type="dxa"/>
+              <w:left w:w="57" w:type="dxa"/>
+              <w:bottom w:w="57" w:type="dxa"/>
+              <w:right w:w="57" w:type="dxa"/>
+            </w:tcMar>
+            <w:shd w:val="clear" w:color="auto" w:fill="D9D9D9"/>
+          </w:tcPr>
+          <w:p>
+            <w:r>
+              <w:rPr>
+                <w:rFonts w:ascii="Arial" w:hAnsi="Arial" w:cs="Arial"/>
                 <w:b/>
+                <w:color w:val="000000"/>
+                <w:sz w:val="20"/>
               </w:rPr>
               <w:t>Sub-topik</w:t>
             </w:r>
@@ -676,12 +1327,26 @@
         </w:tc>
       </w:tr>
       <w:tr>
-        <w:tc>
-          <w:tcPr>
-            <w:tcW w:type="dxa" w:w="4513"/>
-          </w:tcPr>
-          <w:p>
-            <w:r>
+        <w:trPr>
+          <w:cantSplit w:val="true"/>
+        </w:trPr>
+        <w:tc>
+          <w:tcPr>
+            <w:tcW w:type="dxa" w:w="4513"/>
+            <w:tcMar>
+              <w:top w:w="57" w:type="dxa"/>
+              <w:left w:w="57" w:type="dxa"/>
+              <w:bottom w:w="57" w:type="dxa"/>
+              <w:right w:w="57" w:type="dxa"/>
+            </w:tcMar>
+          </w:tcPr>
+          <w:p>
+            <w:r>
+              <w:rPr>
+                <w:rFonts w:ascii="Arial" w:hAnsi="Arial" w:cs="Arial"/>
+                <w:color w:val="000000"/>
+                <w:sz w:val="20"/>
+              </w:rPr>
               <w:t>Bab 1: Project Material</w:t>
             </w:r>
           </w:p>
@@ -689,9 +1354,20 @@
         <w:tc>
           <w:tcPr>
             <w:tcW w:type="dxa" w:w="4513"/>
-          </w:tcPr>
-          <w:p>
-            <w:r>
+            <w:tcMar>
+              <w:top w:w="57" w:type="dxa"/>
+              <w:left w:w="57" w:type="dxa"/>
+              <w:bottom w:w="57" w:type="dxa"/>
+              <w:right w:w="57" w:type="dxa"/>
+            </w:tcMar>
+          </w:tcPr>
+          <w:p>
+            <w:r>
+              <w:rPr>
+                <w:rFonts w:ascii="Arial" w:hAnsi="Arial" w:cs="Arial"/>
+                <w:color w:val="000000"/>
+                <w:sz w:val="20"/>
+              </w:rPr>
               <w:t>1. Kategori Format Bahan Projek</w:t>
               <w:br/>
               <w:t>2. Kesan Format terhadap Kerja Ingest</w:t>
@@ -702,12 +1378,26 @@
         </w:tc>
       </w:tr>
       <w:tr>
-        <w:tc>
-          <w:tcPr>
-            <w:tcW w:type="dxa" w:w="4513"/>
-          </w:tcPr>
-          <w:p>
-            <w:r>
+        <w:trPr>
+          <w:cantSplit w:val="true"/>
+        </w:trPr>
+        <w:tc>
+          <w:tcPr>
+            <w:tcW w:type="dxa" w:w="4513"/>
+            <w:tcMar>
+              <w:top w:w="57" w:type="dxa"/>
+              <w:left w:w="57" w:type="dxa"/>
+              <w:bottom w:w="57" w:type="dxa"/>
+              <w:right w:w="57" w:type="dxa"/>
+            </w:tcMar>
+          </w:tcPr>
+          <w:p>
+            <w:r>
+              <w:rPr>
+                <w:rFonts w:ascii="Arial" w:hAnsi="Arial" w:cs="Arial"/>
+                <w:color w:val="000000"/>
+                <w:sz w:val="20"/>
+              </w:rPr>
               <w:t>Bab 2: Frame Rate</w:t>
             </w:r>
           </w:p>
@@ -715,9 +1405,20 @@
         <w:tc>
           <w:tcPr>
             <w:tcW w:type="dxa" w:w="4513"/>
-          </w:tcPr>
-          <w:p>
-            <w:r>
+            <w:tcMar>
+              <w:top w:w="57" w:type="dxa"/>
+              <w:left w:w="57" w:type="dxa"/>
+              <w:bottom w:w="57" w:type="dxa"/>
+              <w:right w:w="57" w:type="dxa"/>
+            </w:tcMar>
+          </w:tcPr>
+          <w:p>
+            <w:r>
+              <w:rPr>
+                <w:rFonts w:ascii="Arial" w:hAnsi="Arial" w:cs="Arial"/>
+                <w:color w:val="000000"/>
+                <w:sz w:val="20"/>
+              </w:rPr>
               <w:t>1. Definisi Frame Rate</w:t>
               <w:br/>
               <w:t>2. Jenis-jenis Frame Rate (verbatim CoCU)</w:t>
@@ -728,12 +1429,26 @@
         </w:tc>
       </w:tr>
       <w:tr>
-        <w:tc>
-          <w:tcPr>
-            <w:tcW w:type="dxa" w:w="4513"/>
-          </w:tcPr>
-          <w:p>
-            <w:r>
+        <w:trPr>
+          <w:cantSplit w:val="true"/>
+        </w:trPr>
+        <w:tc>
+          <w:tcPr>
+            <w:tcW w:type="dxa" w:w="4513"/>
+            <w:tcMar>
+              <w:top w:w="57" w:type="dxa"/>
+              <w:left w:w="57" w:type="dxa"/>
+              <w:bottom w:w="57" w:type="dxa"/>
+              <w:right w:w="57" w:type="dxa"/>
+            </w:tcMar>
+          </w:tcPr>
+          <w:p>
+            <w:r>
+              <w:rPr>
+                <w:rFonts w:ascii="Arial" w:hAnsi="Arial" w:cs="Arial"/>
+                <w:color w:val="000000"/>
+                <w:sz w:val="20"/>
+              </w:rPr>
               <w:t>Bab 3: Scanning Lines</w:t>
             </w:r>
           </w:p>
@@ -741,9 +1456,20 @@
         <w:tc>
           <w:tcPr>
             <w:tcW w:type="dxa" w:w="4513"/>
-          </w:tcPr>
-          <w:p>
-            <w:r>
+            <w:tcMar>
+              <w:top w:w="57" w:type="dxa"/>
+              <w:left w:w="57" w:type="dxa"/>
+              <w:bottom w:w="57" w:type="dxa"/>
+              <w:right w:w="57" w:type="dxa"/>
+            </w:tcMar>
+          </w:tcPr>
+          <w:p>
+            <w:r>
+              <w:rPr>
+                <w:rFonts w:ascii="Arial" w:hAnsi="Arial" w:cs="Arial"/>
+                <w:color w:val="000000"/>
+                <w:sz w:val="20"/>
+              </w:rPr>
               <w:t>1. Interlaced (i)</w:t>
               <w:br/>
               <w:t>2. Progressive (p)</w:t>
@@ -754,12 +1480,26 @@
         </w:tc>
       </w:tr>
       <w:tr>
-        <w:tc>
-          <w:tcPr>
-            <w:tcW w:type="dxa" w:w="4513"/>
-          </w:tcPr>
-          <w:p>
-            <w:r>
+        <w:trPr>
+          <w:cantSplit w:val="true"/>
+        </w:trPr>
+        <w:tc>
+          <w:tcPr>
+            <w:tcW w:type="dxa" w:w="4513"/>
+            <w:tcMar>
+              <w:top w:w="57" w:type="dxa"/>
+              <w:left w:w="57" w:type="dxa"/>
+              <w:bottom w:w="57" w:type="dxa"/>
+              <w:right w:w="57" w:type="dxa"/>
+            </w:tcMar>
+          </w:tcPr>
+          <w:p>
+            <w:r>
+              <w:rPr>
+                <w:rFonts w:ascii="Arial" w:hAnsi="Arial" w:cs="Arial"/>
+                <w:color w:val="000000"/>
+                <w:sz w:val="20"/>
+              </w:rPr>
               <w:t>Bab 4: Aspect Ratio</w:t>
             </w:r>
           </w:p>
@@ -767,9 +1507,20 @@
         <w:tc>
           <w:tcPr>
             <w:tcW w:type="dxa" w:w="4513"/>
-          </w:tcPr>
-          <w:p>
-            <w:r>
+            <w:tcMar>
+              <w:top w:w="57" w:type="dxa"/>
+              <w:left w:w="57" w:type="dxa"/>
+              <w:bottom w:w="57" w:type="dxa"/>
+              <w:right w:w="57" w:type="dxa"/>
+            </w:tcMar>
+          </w:tcPr>
+          <w:p>
+            <w:r>
+              <w:rPr>
+                <w:rFonts w:ascii="Arial" w:hAnsi="Arial" w:cs="Arial"/>
+                <w:color w:val="000000"/>
+                <w:sz w:val="20"/>
+              </w:rPr>
               <w:t>1. Definisi Aspect Ratio</w:t>
               <w:br/>
               <w:t>2. Jenis-jenis Aspect Ratio (verbatim CoCU)</w:t>
@@ -780,12 +1531,26 @@
         </w:tc>
       </w:tr>
       <w:tr>
-        <w:tc>
-          <w:tcPr>
-            <w:tcW w:type="dxa" w:w="4513"/>
-          </w:tcPr>
-          <w:p>
-            <w:r>
+        <w:trPr>
+          <w:cantSplit w:val="true"/>
+        </w:trPr>
+        <w:tc>
+          <w:tcPr>
+            <w:tcW w:type="dxa" w:w="4513"/>
+            <w:tcMar>
+              <w:top w:w="57" w:type="dxa"/>
+              <w:left w:w="57" w:type="dxa"/>
+              <w:bottom w:w="57" w:type="dxa"/>
+              <w:right w:w="57" w:type="dxa"/>
+            </w:tcMar>
+          </w:tcPr>
+          <w:p>
+            <w:r>
+              <w:rPr>
+                <w:rFonts w:ascii="Arial" w:hAnsi="Arial" w:cs="Arial"/>
+                <w:color w:val="000000"/>
+                <w:sz w:val="20"/>
+              </w:rPr>
               <w:t>Bab 5: Frame Dimension</w:t>
             </w:r>
           </w:p>
@@ -793,9 +1558,20 @@
         <w:tc>
           <w:tcPr>
             <w:tcW w:type="dxa" w:w="4513"/>
-          </w:tcPr>
-          <w:p>
-            <w:r>
+            <w:tcMar>
+              <w:top w:w="57" w:type="dxa"/>
+              <w:left w:w="57" w:type="dxa"/>
+              <w:bottom w:w="57" w:type="dxa"/>
+              <w:right w:w="57" w:type="dxa"/>
+            </w:tcMar>
+          </w:tcPr>
+          <w:p>
+            <w:r>
+              <w:rPr>
+                <w:rFonts w:ascii="Arial" w:hAnsi="Arial" w:cs="Arial"/>
+                <w:color w:val="000000"/>
+                <w:sz w:val="20"/>
+              </w:rPr>
               <w:t>1. Definisi Frame Dimension</w:t>
               <w:br/>
               <w:t>2. Nilai-nilai Standard (verbatim CoCU)</w:t>
@@ -808,22 +1584,38 @@
     </w:tbl>
     <w:p/>
     <w:p>
+      <w:pPr>
+        <w:spacing w:before="120" w:after="120" w:line="276" w:lineRule="auto"/>
+        <w:jc w:val="left"/>
+      </w:pPr>
       <w:r>
         <w:rPr>
+          <w:rFonts w:ascii="Arial" w:hAnsi="Arial" w:cs="Arial"/>
           <w:b/>
-          <w:sz w:val="24"/>
+          <w:color w:val="000000"/>
+          <w:sz w:val="22"/>
         </w:rPr>
         <w:t>Aktiviti Kerja 4: Preview footage  (IT-072-3:2012-C01-W04)</w:t>
       </w:r>
     </w:p>
     <w:p>
+      <w:pPr>
+        <w:spacing w:line="276" w:lineRule="auto" w:after="120"/>
+        <w:jc w:val="left"/>
+      </w:pPr>
       <w:r>
+        <w:rPr>
+          <w:rFonts w:ascii="Arial" w:hAnsi="Arial" w:cs="Arial"/>
+          <w:color w:val="000000"/>
+          <w:sz w:val="22"/>
+        </w:rPr>
         <w:t>Rangka topik (Bab dan sub-topik):</w:t>
       </w:r>
     </w:p>
     <w:tbl>
       <w:tblPr>
         <w:tblW w:type="auto" w:w="0"/>
+        <w:tblLayout w:type="autofit"/>
         <w:tblLook w:firstColumn="1" w:firstRow="1" w:lastColumn="0" w:lastRow="0" w:noHBand="0" w:noVBand="1" w:val="04A0"/>
       </w:tblPr>
       <w:tblGrid>
@@ -831,14 +1623,28 @@
         <w:gridCol w:w="4513"/>
       </w:tblGrid>
       <w:tr>
-        <w:tc>
-          <w:tcPr>
-            <w:tcW w:type="dxa" w:w="4513"/>
-          </w:tcPr>
-          <w:p>
-            <w:r>
-              <w:rPr>
+        <w:trPr>
+          <w:tblHeader w:val="true"/>
+          <w:cantSplit w:val="true"/>
+        </w:trPr>
+        <w:tc>
+          <w:tcPr>
+            <w:tcW w:type="dxa" w:w="4513"/>
+            <w:tcMar>
+              <w:top w:w="57" w:type="dxa"/>
+              <w:left w:w="57" w:type="dxa"/>
+              <w:bottom w:w="57" w:type="dxa"/>
+              <w:right w:w="57" w:type="dxa"/>
+            </w:tcMar>
+            <w:shd w:val="clear" w:color="auto" w:fill="D9D9D9"/>
+          </w:tcPr>
+          <w:p>
+            <w:r>
+              <w:rPr>
+                <w:rFonts w:ascii="Arial" w:hAnsi="Arial" w:cs="Arial"/>
                 <w:b/>
+                <w:color w:val="000000"/>
+                <w:sz w:val="20"/>
               </w:rPr>
               <w:t>Bab</w:t>
             </w:r>
@@ -847,11 +1653,21 @@
         <w:tc>
           <w:tcPr>
             <w:tcW w:type="dxa" w:w="4513"/>
-          </w:tcPr>
-          <w:p>
-            <w:r>
-              <w:rPr>
+            <w:tcMar>
+              <w:top w:w="57" w:type="dxa"/>
+              <w:left w:w="57" w:type="dxa"/>
+              <w:bottom w:w="57" w:type="dxa"/>
+              <w:right w:w="57" w:type="dxa"/>
+            </w:tcMar>
+            <w:shd w:val="clear" w:color="auto" w:fill="D9D9D9"/>
+          </w:tcPr>
+          <w:p>
+            <w:r>
+              <w:rPr>
+                <w:rFonts w:ascii="Arial" w:hAnsi="Arial" w:cs="Arial"/>
                 <w:b/>
+                <w:color w:val="000000"/>
+                <w:sz w:val="20"/>
               </w:rPr>
               <w:t>Sub-topik</w:t>
             </w:r>
@@ -859,12 +1675,26 @@
         </w:tc>
       </w:tr>
       <w:tr>
-        <w:tc>
-          <w:tcPr>
-            <w:tcW w:type="dxa" w:w="4513"/>
-          </w:tcPr>
-          <w:p>
-            <w:r>
+        <w:trPr>
+          <w:cantSplit w:val="true"/>
+        </w:trPr>
+        <w:tc>
+          <w:tcPr>
+            <w:tcW w:type="dxa" w:w="4513"/>
+            <w:tcMar>
+              <w:top w:w="57" w:type="dxa"/>
+              <w:left w:w="57" w:type="dxa"/>
+              <w:bottom w:w="57" w:type="dxa"/>
+              <w:right w:w="57" w:type="dxa"/>
+            </w:tcMar>
+          </w:tcPr>
+          <w:p>
+            <w:r>
+              <w:rPr>
+                <w:rFonts w:ascii="Arial" w:hAnsi="Arial" w:cs="Arial"/>
+                <w:color w:val="000000"/>
+                <w:sz w:val="20"/>
+              </w:rPr>
               <w:t>Bab 1: Computer Software and Hardware</w:t>
             </w:r>
           </w:p>
@@ -872,9 +1702,20 @@
         <w:tc>
           <w:tcPr>
             <w:tcW w:type="dxa" w:w="4513"/>
-          </w:tcPr>
-          <w:p>
-            <w:r>
+            <w:tcMar>
+              <w:top w:w="57" w:type="dxa"/>
+              <w:left w:w="57" w:type="dxa"/>
+              <w:bottom w:w="57" w:type="dxa"/>
+              <w:right w:w="57" w:type="dxa"/>
+            </w:tcMar>
+          </w:tcPr>
+          <w:p>
+            <w:r>
+              <w:rPr>
+                <w:rFonts w:ascii="Arial" w:hAnsi="Arial" w:cs="Arial"/>
+                <w:color w:val="000000"/>
+                <w:sz w:val="20"/>
+              </w:rPr>
               <w:t>1. Tiga Komponen Utama (verbatim CoCU)</w:t>
               <w:br/>
               <w:t>2. Kepentingan Keserasian</w:t>
@@ -883,12 +1724,26 @@
         </w:tc>
       </w:tr>
       <w:tr>
-        <w:tc>
-          <w:tcPr>
-            <w:tcW w:type="dxa" w:w="4513"/>
-          </w:tcPr>
-          <w:p>
-            <w:r>
+        <w:trPr>
+          <w:cantSplit w:val="true"/>
+        </w:trPr>
+        <w:tc>
+          <w:tcPr>
+            <w:tcW w:type="dxa" w:w="4513"/>
+            <w:tcMar>
+              <w:top w:w="57" w:type="dxa"/>
+              <w:left w:w="57" w:type="dxa"/>
+              <w:bottom w:w="57" w:type="dxa"/>
+              <w:right w:w="57" w:type="dxa"/>
+            </w:tcMar>
+          </w:tcPr>
+          <w:p>
+            <w:r>
+              <w:rPr>
+                <w:rFonts w:ascii="Arial" w:hAnsi="Arial" w:cs="Arial"/>
+                <w:color w:val="000000"/>
+                <w:sz w:val="20"/>
+              </w:rPr>
               <w:t>Bab 2: Type of Material</w:t>
             </w:r>
           </w:p>
@@ -896,9 +1751,20 @@
         <w:tc>
           <w:tcPr>
             <w:tcW w:type="dxa" w:w="4513"/>
-          </w:tcPr>
-          <w:p>
-            <w:r>
+            <w:tcMar>
+              <w:top w:w="57" w:type="dxa"/>
+              <w:left w:w="57" w:type="dxa"/>
+              <w:bottom w:w="57" w:type="dxa"/>
+              <w:right w:w="57" w:type="dxa"/>
+            </w:tcMar>
+          </w:tcPr>
+          <w:p>
+            <w:r>
+              <w:rPr>
+                <w:rFonts w:ascii="Arial" w:hAnsi="Arial" w:cs="Arial"/>
+                <w:color w:val="000000"/>
+                <w:sz w:val="20"/>
+              </w:rPr>
               <w:t>1. Tiga Kategori Jenis Bahan (verbatim CoCU)</w:t>
               <w:br/>
               <w:t>2. Perbezaan Kaedah Pratonton</w:t>
@@ -907,12 +1773,26 @@
         </w:tc>
       </w:tr>
       <w:tr>
-        <w:tc>
-          <w:tcPr>
-            <w:tcW w:type="dxa" w:w="4513"/>
-          </w:tcPr>
-          <w:p>
-            <w:r>
+        <w:trPr>
+          <w:cantSplit w:val="true"/>
+        </w:trPr>
+        <w:tc>
+          <w:tcPr>
+            <w:tcW w:type="dxa" w:w="4513"/>
+            <w:tcMar>
+              <w:top w:w="57" w:type="dxa"/>
+              <w:left w:w="57" w:type="dxa"/>
+              <w:bottom w:w="57" w:type="dxa"/>
+              <w:right w:w="57" w:type="dxa"/>
+            </w:tcMar>
+          </w:tcPr>
+          <w:p>
+            <w:r>
+              <w:rPr>
+                <w:rFonts w:ascii="Arial" w:hAnsi="Arial" w:cs="Arial"/>
+                <w:color w:val="000000"/>
+                <w:sz w:val="20"/>
+              </w:rPr>
               <w:t>Bab 3: Required Shot</w:t>
             </w:r>
           </w:p>
@@ -920,9 +1800,20 @@
         <w:tc>
           <w:tcPr>
             <w:tcW w:type="dxa" w:w="4513"/>
-          </w:tcPr>
-          <w:p>
-            <w:r>
+            <w:tcMar>
+              <w:top w:w="57" w:type="dxa"/>
+              <w:left w:w="57" w:type="dxa"/>
+              <w:bottom w:w="57" w:type="dxa"/>
+              <w:right w:w="57" w:type="dxa"/>
+            </w:tcMar>
+          </w:tcPr>
+          <w:p>
+            <w:r>
+              <w:rPr>
+                <w:rFonts w:ascii="Arial" w:hAnsi="Arial" w:cs="Arial"/>
+                <w:color w:val="000000"/>
+                <w:sz w:val="20"/>
+              </w:rPr>
               <w:t>1. Good Takes</w:t>
               <w:br/>
               <w:t>2. KIV Takes (Keep In View)</w:t>
@@ -933,12 +1824,26 @@
         </w:tc>
       </w:tr>
       <w:tr>
-        <w:tc>
-          <w:tcPr>
-            <w:tcW w:type="dxa" w:w="4513"/>
-          </w:tcPr>
-          <w:p>
-            <w:r>
+        <w:trPr>
+          <w:cantSplit w:val="true"/>
+        </w:trPr>
+        <w:tc>
+          <w:tcPr>
+            <w:tcW w:type="dxa" w:w="4513"/>
+            <w:tcMar>
+              <w:top w:w="57" w:type="dxa"/>
+              <w:left w:w="57" w:type="dxa"/>
+              <w:bottom w:w="57" w:type="dxa"/>
+              <w:right w:w="57" w:type="dxa"/>
+            </w:tcMar>
+          </w:tcPr>
+          <w:p>
+            <w:r>
+              <w:rPr>
+                <w:rFonts w:ascii="Arial" w:hAnsi="Arial" w:cs="Arial"/>
+                <w:color w:val="000000"/>
+                <w:sz w:val="20"/>
+              </w:rPr>
               <w:t>Bab 4: Footage Format Conversion</w:t>
             </w:r>
           </w:p>
@@ -946,9 +1851,20 @@
         <w:tc>
           <w:tcPr>
             <w:tcW w:type="dxa" w:w="4513"/>
-          </w:tcPr>
-          <w:p>
-            <w:r>
+            <w:tcMar>
+              <w:top w:w="57" w:type="dxa"/>
+              <w:left w:w="57" w:type="dxa"/>
+              <w:bottom w:w="57" w:type="dxa"/>
+              <w:right w:w="57" w:type="dxa"/>
+            </w:tcMar>
+          </w:tcPr>
+          <w:p>
+            <w:r>
+              <w:rPr>
+                <w:rFonts w:ascii="Arial" w:hAnsi="Arial" w:cs="Arial"/>
+                <w:color w:val="000000"/>
+                <w:sz w:val="20"/>
+              </w:rPr>
               <w:t>1. Jenis-jenis Konversi (verbatim CoCU)</w:t>
               <w:br/>
               <w:t>2. Kepentingan Perancangan Awal</w:t>
@@ -957,12 +1873,26 @@
         </w:tc>
       </w:tr>
       <w:tr>
-        <w:tc>
-          <w:tcPr>
-            <w:tcW w:type="dxa" w:w="4513"/>
-          </w:tcPr>
-          <w:p>
-            <w:r>
+        <w:trPr>
+          <w:cantSplit w:val="true"/>
+        </w:trPr>
+        <w:tc>
+          <w:tcPr>
+            <w:tcW w:type="dxa" w:w="4513"/>
+            <w:tcMar>
+              <w:top w:w="57" w:type="dxa"/>
+              <w:left w:w="57" w:type="dxa"/>
+              <w:bottom w:w="57" w:type="dxa"/>
+              <w:right w:w="57" w:type="dxa"/>
+            </w:tcMar>
+          </w:tcPr>
+          <w:p>
+            <w:r>
+              <w:rPr>
+                <w:rFonts w:ascii="Arial" w:hAnsi="Arial" w:cs="Arial"/>
+                <w:color w:val="000000"/>
+                <w:sz w:val="20"/>
+              </w:rPr>
               <w:t>Bab 5: Continuity Sheet</w:t>
             </w:r>
           </w:p>
@@ -970,9 +1900,20 @@
         <w:tc>
           <w:tcPr>
             <w:tcW w:type="dxa" w:w="4513"/>
-          </w:tcPr>
-          <w:p>
-            <w:r>
+            <w:tcMar>
+              <w:top w:w="57" w:type="dxa"/>
+              <w:left w:w="57" w:type="dxa"/>
+              <w:bottom w:w="57" w:type="dxa"/>
+              <w:right w:w="57" w:type="dxa"/>
+            </w:tcMar>
+          </w:tcPr>
+          <w:p>
+            <w:r>
+              <w:rPr>
+                <w:rFonts w:ascii="Arial" w:hAnsi="Arial" w:cs="Arial"/>
+                <w:color w:val="000000"/>
+                <w:sz w:val="20"/>
+              </w:rPr>
               <w:t>1. Definisi dan Kandungan</w:t>
               <w:br/>
               <w:t>2. Kegunaan Semasa Pratonton</w:t>
@@ -985,22 +1926,38 @@
     </w:tbl>
     <w:p/>
     <w:p>
+      <w:pPr>
+        <w:spacing w:before="120" w:after="120" w:line="276" w:lineRule="auto"/>
+        <w:jc w:val="left"/>
+      </w:pPr>
       <w:r>
         <w:rPr>
+          <w:rFonts w:ascii="Arial" w:hAnsi="Arial" w:cs="Arial"/>
           <w:b/>
-          <w:sz w:val="24"/>
+          <w:color w:val="000000"/>
+          <w:sz w:val="22"/>
         </w:rPr>
         <w:t>Aktiviti Kerja 5: Produce project workflow  (IT-072-3:2012-C01-W05)</w:t>
       </w:r>
     </w:p>
     <w:p>
+      <w:pPr>
+        <w:spacing w:line="276" w:lineRule="auto" w:after="120"/>
+        <w:jc w:val="left"/>
+      </w:pPr>
       <w:r>
+        <w:rPr>
+          <w:rFonts w:ascii="Arial" w:hAnsi="Arial" w:cs="Arial"/>
+          <w:color w:val="000000"/>
+          <w:sz w:val="22"/>
+        </w:rPr>
         <w:t>Rangka topik (Bab dan sub-topik):</w:t>
       </w:r>
     </w:p>
     <w:tbl>
       <w:tblPr>
         <w:tblW w:type="auto" w:w="0"/>
+        <w:tblLayout w:type="autofit"/>
         <w:tblLook w:firstColumn="1" w:firstRow="1" w:lastColumn="0" w:lastRow="0" w:noHBand="0" w:noVBand="1" w:val="04A0"/>
       </w:tblPr>
       <w:tblGrid>
@@ -1008,14 +1965,28 @@
         <w:gridCol w:w="4513"/>
       </w:tblGrid>
       <w:tr>
-        <w:tc>
-          <w:tcPr>
-            <w:tcW w:type="dxa" w:w="4513"/>
-          </w:tcPr>
-          <w:p>
-            <w:r>
-              <w:rPr>
+        <w:trPr>
+          <w:tblHeader w:val="true"/>
+          <w:cantSplit w:val="true"/>
+        </w:trPr>
+        <w:tc>
+          <w:tcPr>
+            <w:tcW w:type="dxa" w:w="4513"/>
+            <w:tcMar>
+              <w:top w:w="57" w:type="dxa"/>
+              <w:left w:w="57" w:type="dxa"/>
+              <w:bottom w:w="57" w:type="dxa"/>
+              <w:right w:w="57" w:type="dxa"/>
+            </w:tcMar>
+            <w:shd w:val="clear" w:color="auto" w:fill="D9D9D9"/>
+          </w:tcPr>
+          <w:p>
+            <w:r>
+              <w:rPr>
+                <w:rFonts w:ascii="Arial" w:hAnsi="Arial" w:cs="Arial"/>
                 <w:b/>
+                <w:color w:val="000000"/>
+                <w:sz w:val="20"/>
               </w:rPr>
               <w:t>Bab</w:t>
             </w:r>
@@ -1024,11 +1995,21 @@
         <w:tc>
           <w:tcPr>
             <w:tcW w:type="dxa" w:w="4513"/>
-          </w:tcPr>
-          <w:p>
-            <w:r>
-              <w:rPr>
+            <w:tcMar>
+              <w:top w:w="57" w:type="dxa"/>
+              <w:left w:w="57" w:type="dxa"/>
+              <w:bottom w:w="57" w:type="dxa"/>
+              <w:right w:w="57" w:type="dxa"/>
+            </w:tcMar>
+            <w:shd w:val="clear" w:color="auto" w:fill="D9D9D9"/>
+          </w:tcPr>
+          <w:p>
+            <w:r>
+              <w:rPr>
+                <w:rFonts w:ascii="Arial" w:hAnsi="Arial" w:cs="Arial"/>
                 <w:b/>
+                <w:color w:val="000000"/>
+                <w:sz w:val="20"/>
               </w:rPr>
               <w:t>Sub-topik</w:t>
             </w:r>
@@ -1036,12 +2017,26 @@
         </w:tc>
       </w:tr>
       <w:tr>
-        <w:tc>
-          <w:tcPr>
-            <w:tcW w:type="dxa" w:w="4513"/>
-          </w:tcPr>
-          <w:p>
-            <w:r>
+        <w:trPr>
+          <w:cantSplit w:val="true"/>
+        </w:trPr>
+        <w:tc>
+          <w:tcPr>
+            <w:tcW w:type="dxa" w:w="4513"/>
+            <w:tcMar>
+              <w:top w:w="57" w:type="dxa"/>
+              <w:left w:w="57" w:type="dxa"/>
+              <w:bottom w:w="57" w:type="dxa"/>
+              <w:right w:w="57" w:type="dxa"/>
+            </w:tcMar>
+          </w:tcPr>
+          <w:p>
+            <w:r>
+              <w:rPr>
+                <w:rFonts w:ascii="Arial" w:hAnsi="Arial" w:cs="Arial"/>
+                <w:color w:val="000000"/>
+                <w:sz w:val="20"/>
+              </w:rPr>
               <w:t>Bab 1: Offline Editing Process</w:t>
             </w:r>
           </w:p>
@@ -1049,9 +2044,20 @@
         <w:tc>
           <w:tcPr>
             <w:tcW w:type="dxa" w:w="4513"/>
-          </w:tcPr>
-          <w:p>
-            <w:r>
+            <w:tcMar>
+              <w:top w:w="57" w:type="dxa"/>
+              <w:left w:w="57" w:type="dxa"/>
+              <w:bottom w:w="57" w:type="dxa"/>
+              <w:right w:w="57" w:type="dxa"/>
+            </w:tcMar>
+          </w:tcPr>
+          <w:p>
+            <w:r>
+              <w:rPr>
+                <w:rFonts w:ascii="Arial" w:hAnsi="Arial" w:cs="Arial"/>
+                <w:color w:val="000000"/>
+                <w:sz w:val="20"/>
+              </w:rPr>
               <w:t>1. Definisi Offline Editing</w:t>
               <w:br/>
               <w:t>2. Peringkat-peringkat Proses Offline</w:t>
@@ -1060,12 +2066,26 @@
         </w:tc>
       </w:tr>
       <w:tr>
-        <w:tc>
-          <w:tcPr>
-            <w:tcW w:type="dxa" w:w="4513"/>
-          </w:tcPr>
-          <w:p>
-            <w:r>
+        <w:trPr>
+          <w:cantSplit w:val="true"/>
+        </w:trPr>
+        <w:tc>
+          <w:tcPr>
+            <w:tcW w:type="dxa" w:w="4513"/>
+            <w:tcMar>
+              <w:top w:w="57" w:type="dxa"/>
+              <w:left w:w="57" w:type="dxa"/>
+              <w:bottom w:w="57" w:type="dxa"/>
+              <w:right w:w="57" w:type="dxa"/>
+            </w:tcMar>
+          </w:tcPr>
+          <w:p>
+            <w:r>
+              <w:rPr>
+                <w:rFonts w:ascii="Arial" w:hAnsi="Arial" w:cs="Arial"/>
+                <w:color w:val="000000"/>
+                <w:sz w:val="20"/>
+              </w:rPr>
               <w:t>Bab 2: Online Editing Process</w:t>
             </w:r>
           </w:p>
@@ -1073,9 +2093,20 @@
         <w:tc>
           <w:tcPr>
             <w:tcW w:type="dxa" w:w="4513"/>
-          </w:tcPr>
-          <w:p>
-            <w:r>
+            <w:tcMar>
+              <w:top w:w="57" w:type="dxa"/>
+              <w:left w:w="57" w:type="dxa"/>
+              <w:bottom w:w="57" w:type="dxa"/>
+              <w:right w:w="57" w:type="dxa"/>
+            </w:tcMar>
+          </w:tcPr>
+          <w:p>
+            <w:r>
+              <w:rPr>
+                <w:rFonts w:ascii="Arial" w:hAnsi="Arial" w:cs="Arial"/>
+                <w:color w:val="000000"/>
+                <w:sz w:val="20"/>
+              </w:rPr>
               <w:t>1. Definisi Online Editing</w:t>
               <w:br/>
               <w:t>2. Peringkat-peringkat Proses Online</w:t>
@@ -1084,12 +2115,26 @@
         </w:tc>
       </w:tr>
       <w:tr>
-        <w:tc>
-          <w:tcPr>
-            <w:tcW w:type="dxa" w:w="4513"/>
-          </w:tcPr>
-          <w:p>
-            <w:r>
+        <w:trPr>
+          <w:cantSplit w:val="true"/>
+        </w:trPr>
+        <w:tc>
+          <w:tcPr>
+            <w:tcW w:type="dxa" w:w="4513"/>
+            <w:tcMar>
+              <w:top w:w="57" w:type="dxa"/>
+              <w:left w:w="57" w:type="dxa"/>
+              <w:bottom w:w="57" w:type="dxa"/>
+              <w:right w:w="57" w:type="dxa"/>
+            </w:tcMar>
+          </w:tcPr>
+          <w:p>
+            <w:r>
+              <w:rPr>
+                <w:rFonts w:ascii="Arial" w:hAnsi="Arial" w:cs="Arial"/>
+                <w:color w:val="000000"/>
+                <w:sz w:val="20"/>
+              </w:rPr>
               <w:t>Bab 3: Project Duration</w:t>
             </w:r>
           </w:p>
@@ -1097,9 +2142,20 @@
         <w:tc>
           <w:tcPr>
             <w:tcW w:type="dxa" w:w="4513"/>
-          </w:tcPr>
-          <w:p>
-            <w:r>
+            <w:tcMar>
+              <w:top w:w="57" w:type="dxa"/>
+              <w:left w:w="57" w:type="dxa"/>
+              <w:bottom w:w="57" w:type="dxa"/>
+              <w:right w:w="57" w:type="dxa"/>
+            </w:tcMar>
+          </w:tcPr>
+          <w:p>
+            <w:r>
+              <w:rPr>
+                <w:rFonts w:ascii="Arial" w:hAnsi="Arial" w:cs="Arial"/>
+                <w:color w:val="000000"/>
+                <w:sz w:val="20"/>
+              </w:rPr>
               <w:t>1. Daripada Anggaran kepada Pelaksanaan</w:t>
               <w:br/>
               <w:t>2. Perincian Tempoh Setiap Fasa</w:t>
@@ -1108,12 +2164,26 @@
         </w:tc>
       </w:tr>
       <w:tr>
-        <w:tc>
-          <w:tcPr>
-            <w:tcW w:type="dxa" w:w="4513"/>
-          </w:tcPr>
-          <w:p>
-            <w:r>
+        <w:trPr>
+          <w:cantSplit w:val="true"/>
+        </w:trPr>
+        <w:tc>
+          <w:tcPr>
+            <w:tcW w:type="dxa" w:w="4513"/>
+            <w:tcMar>
+              <w:top w:w="57" w:type="dxa"/>
+              <w:left w:w="57" w:type="dxa"/>
+              <w:bottom w:w="57" w:type="dxa"/>
+              <w:right w:w="57" w:type="dxa"/>
+            </w:tcMar>
+          </w:tcPr>
+          <w:p>
+            <w:r>
+              <w:rPr>
+                <w:rFonts w:ascii="Arial" w:hAnsi="Arial" w:cs="Arial"/>
+                <w:color w:val="000000"/>
+                <w:sz w:val="20"/>
+              </w:rPr>
               <w:t>Bab 4: Working Schedule</w:t>
             </w:r>
           </w:p>
@@ -1121,9 +2191,20 @@
         <w:tc>
           <w:tcPr>
             <w:tcW w:type="dxa" w:w="4513"/>
-          </w:tcPr>
-          <w:p>
-            <w:r>
+            <w:tcMar>
+              <w:top w:w="57" w:type="dxa"/>
+              <w:left w:w="57" w:type="dxa"/>
+              <w:bottom w:w="57" w:type="dxa"/>
+              <w:right w:w="57" w:type="dxa"/>
+            </w:tcMar>
+          </w:tcPr>
+          <w:p>
+            <w:r>
+              <w:rPr>
+                <w:rFonts w:ascii="Arial" w:hAnsi="Arial" w:cs="Arial"/>
+                <w:color w:val="000000"/>
+                <w:sz w:val="20"/>
+              </w:rPr>
               <w:t>1. Definisi Jadual Kerja</w:t>
               <w:br/>
               <w:t>2. Langkah Menyediakan Jadual Kerja</w:t>

</xml_diff>